<commit_message>
werkend bluetooth communicatie ESP=>PC
</commit_message>
<xml_diff>
--- a/Force pressure censor.docx
+++ b/Force pressure censor.docx
@@ -18,6 +18,12 @@
           <w:szCs w:val="32"/>
         </w:rPr>
         <w:t xml:space="preserve">Sensorproject – Zitpositie detectie</w:t>
+      </w:r>
+      <w:r>
+        <w:rPr>
+          <w:sz w:val="32"/>
+          <w:szCs w:val="32"/>
+        </w:rPr>
       </w:r>
       <w:r>
         <w:rPr>
@@ -340,18 +346,28 @@
           <w:lang w:val="en-US"/>
         </w:rPr>
       </w:r>
-    </w:p>
-    <w:p>
-      <w:pPr>
-        <w:pBdr/>
-        <w:spacing/>
-        <w:ind/>
+      <w:r>
         <w:rPr>
           <w:lang w:val="en-US"/>
         </w:rPr>
+      </w:r>
+    </w:p>
+    <w:p>
+      <w:pPr>
+        <w:pBdr/>
+        <w:spacing/>
+        <w:ind/>
+        <w:rPr>
+          <w:lang w:val="en-US"/>
+        </w:rPr>
       </w:pPr>
       <w:r>
         <w:br w:type="page" w:clear="all"/>
+      </w:r>
+      <w:r>
+        <w:rPr>
+          <w:lang w:val="en-US"/>
+        </w:rPr>
       </w:r>
       <w:r>
         <w:rPr>
@@ -900,11 +916,16 @@
           <w:lang w:val="en-US"/>
         </w:rPr>
       </w:r>
+      <w:r>
+        <w:rPr>
+          <w:highlight w:val="none"/>
+        </w:rPr>
+      </w:r>
     </w:p>
     <w:p>
       <w:pPr>
         <w:pBdr/>
-        <w:shd w:val="nil"/>
+        <w:shd w:val="nil" w:color="auto"/>
         <w:spacing/>
         <w:ind/>
         <w:rPr>
@@ -950,6 +971,12 @@
           <w:lang w:val="en-US"/>
         </w:rPr>
       </w:r>
+      <w:r>
+        <w:rPr>
+          <w:highlight w:val="none"/>
+          <w:lang w:val="en-US" w:bidi="en-US"/>
+        </w:rPr>
+      </w:r>
     </w:p>
     <w:p>
       <w:pPr>
@@ -987,7 +1014,6 @@
         </w:rPr>
         <w:t xml:space="preserve">Vout is de weerstand over R=10kE in serie met Rfsr</w:t>
       </w:r>
-      <w:r/>
       <w:r>
         <w:rPr>
           <w:highlight w:val="none"/>
@@ -1057,7 +1083,6 @@
         </w:rPr>
         <w:t xml:space="preserve">## Als Rf/R2 niet ingedrukt</w:t>
       </w:r>
-      <w:r/>
       <w:r>
         <w:rPr>
           <w:highlight w:val="none"/>
@@ -1065,12 +1090,6 @@
         </w:rPr>
       </w:r>
       <w:r/>
-      <w:r>
-        <w:rPr>
-          <w:highlight w:val="none"/>
-          <w:lang w:val="en-US" w:bidi="en-US"/>
-        </w:rPr>
-      </w:r>
     </w:p>
     <w:p>
       <w:pPr>
@@ -1216,7 +1235,7 @@
     <w:p>
       <w:pPr>
         <w:pBdr/>
-        <w:shd w:val="nil"/>
+        <w:shd w:val="nil" w:color="auto"/>
         <w:spacing/>
         <w:ind/>
         <w:rPr>
@@ -1261,7 +1280,12 @@
         </w:rPr>
         <w:t xml:space="preserve">### Sensor 2 Newton (~2kg)</w:t>
       </w:r>
-      <w:r/>
+      <w:r>
+        <w:rPr>
+          <w:highlight w:val="none"/>
+          <w:lang w:val="en-US" w:bidi="en-US"/>
+        </w:rPr>
+      </w:r>
     </w:p>
     <w:p>
       <w:pPr>
@@ -1567,7 +1591,7 @@
     <w:p>
       <w:pPr>
         <w:pBdr/>
-        <w:shd w:val="nil"/>
+        <w:shd w:val="nil" w:color="auto"/>
         <w:spacing/>
         <w:ind/>
         <w:rPr>
@@ -1612,7 +1636,12 @@
         </w:rPr>
         <w:t xml:space="preserve">### Sensor 1 (0-150kg)</w:t>
       </w:r>
-      <w:r/>
+      <w:r>
+        <w:rPr>
+          <w:highlight w:val="none"/>
+          <w:lang w:val="en-US" w:bidi="en-US"/>
+        </w:rPr>
+      </w:r>
     </w:p>
     <w:p>
       <w:pPr>
@@ -2115,13 +2144,6 @@
         </w:rPr>
       </w:r>
       <w:r/>
-      <w:r>
-        <w:rPr>
-          <w:highlight w:val="none"/>
-          <w:lang w:val="en-US" w:bidi="en-US"/>
-        </w:rPr>
-      </w:r>
-      <w:r/>
     </w:p>
     <w:p>
       <w:pPr>
@@ -2145,6 +2167,12 @@
           <w:lang w:val="en-US" w:bidi="en-US"/>
         </w:rPr>
         <w:t xml:space="preserve">X = Gewicht in kg</w:t>
+      </w:r>
+      <w:r>
+        <w:rPr>
+          <w:highlight w:val="none"/>
+          <w:lang w:val="en-US" w:bidi="en-US"/>
+        </w:rPr>
       </w:r>
       <w:r>
         <w:rPr>
@@ -2183,11 +2211,17 @@
           <w:lang w:val="en-US" w:bidi="en-US"/>
         </w:rPr>
       </w:r>
+      <w:r>
+        <w:rPr>
+          <w:highlight w:val="none"/>
+          <w:lang w:val="en-US" w:bidi="en-US"/>
+        </w:rPr>
+      </w:r>
     </w:p>
     <w:p>
       <w:pPr>
         <w:pBdr/>
-        <w:shd w:val="nil"/>
+        <w:shd w:val="nil" w:color="auto"/>
         <w:spacing/>
         <w:ind/>
         <w:rPr>
@@ -2232,6 +2266,33 @@
         </w:rPr>
         <w:t xml:space="preserve">## Conclusies</w:t>
       </w:r>
+      <w:r>
+        <w:rPr>
+          <w:highlight w:val="none"/>
+          <w:lang w:val="en-US" w:bidi="en-US"/>
+        </w:rPr>
+      </w:r>
+      <w:r>
+        <w:rPr>
+          <w:highlight w:val="none"/>
+          <w:lang w:val="en-US" w:bidi="en-US"/>
+        </w:rPr>
+      </w:r>
+    </w:p>
+    <w:p>
+      <w:pPr>
+        <w:pBdr/>
+        <w:spacing/>
+        <w:ind/>
+        <w:rPr/>
+      </w:pPr>
+      <w:r>
+        <w:rPr>
+          <w:highlight w:val="none"/>
+          <w:lang w:val="en-US" w:bidi="en-US"/>
+        </w:rPr>
+        <w:t xml:space="preserve">FSR-sensoren zijn niet lineair: De weerstand daalt exponentieel met toenemende kracht, wat leidt tot een afnemende spanningsverandering bij hogere belastingen.</w:t>
+      </w:r>
       <w:r/>
       <w:r>
         <w:rPr>
@@ -2240,42 +2301,6 @@
         </w:rPr>
       </w:r>
       <w:r/>
-      <w:r>
-        <w:rPr>
-          <w:highlight w:val="none"/>
-          <w:lang w:val="en-US" w:bidi="en-US"/>
-        </w:rPr>
-      </w:r>
-    </w:p>
-    <w:p>
-      <w:pPr>
-        <w:pBdr/>
-        <w:spacing/>
-        <w:ind/>
-        <w:rPr/>
-      </w:pPr>
-      <w:r>
-        <w:rPr>
-          <w:highlight w:val="none"/>
-          <w:lang w:val="en-US" w:bidi="en-US"/>
-        </w:rPr>
-        <w:t xml:space="preserve">FSR-sensoren zijn niet lineair: De weerstand daalt exponentieel met toenemende kracht, wat leidt tot een afnemende spanningsverandering bij hogere belastingen.</w:t>
-      </w:r>
-      <w:r/>
-    </w:p>
-    <w:p>
-      <w:pPr>
-        <w:pBdr/>
-        <w:spacing/>
-        <w:ind/>
-        <w:rPr/>
-      </w:pPr>
-      <w:r>
-        <w:rPr>
-          <w:highlight w:val="none"/>
-          <w:lang w:val="en-US" w:bidi="en-US"/>
-        </w:rPr>
-      </w:r>
       <w:r/>
     </w:p>
     <w:p>
@@ -2293,20 +2318,13 @@
         <w:t xml:space="preserve">Dode zone bij lichte belasting:  Beide sensoren vertonen vrijwel geen Vout voor gewichten onder ~10 kg (Sensor 1) of onder ~20 g (Sensor 2). Pas boven drempelwaarde treedt meetbare verandering op.</w:t>
       </w:r>
       <w:r/>
-    </w:p>
-    <w:p>
-      <w:pPr>
-        <w:pBdr/>
-        <w:spacing/>
-        <w:ind/>
-        <w:rPr/>
-      </w:pPr>
       <w:r>
         <w:rPr>
           <w:highlight w:val="none"/>
           <w:lang w:val="en-US" w:bidi="en-US"/>
         </w:rPr>
       </w:r>
+      <w:r/>
       <w:r/>
     </w:p>
     <w:p>
@@ -2354,7 +2372,6 @@
         </w:rPr>
         <w:t xml:space="preserve">## Verdere stappen</w:t>
       </w:r>
-      <w:r/>
       <w:r>
         <w:rPr>
           <w:highlight w:val="none"/>
@@ -2362,12 +2379,6 @@
         </w:rPr>
       </w:r>
       <w:r/>
-      <w:r>
-        <w:rPr>
-          <w:highlight w:val="none"/>
-          <w:lang w:val="en-US" w:bidi="en-US"/>
-        </w:rPr>
-      </w:r>
     </w:p>
     <w:p>
       <w:pPr>
@@ -2415,7 +2426,6 @@
         </w:rPr>
         <w:t xml:space="preserve">    - ADC uitlezen (ESP32) – analoge pin, sample rate ≥ 10 Hz. (done)</w:t>
       </w:r>
-      <w:r/>
       <w:r>
         <w:rPr>
           <w:highlight w:val="none"/>
@@ -2423,12 +2433,6 @@
         </w:rPr>
       </w:r>
       <w:r/>
-      <w:r>
-        <w:rPr>
-          <w:highlight w:val="none"/>
-          <w:lang w:val="en-US" w:bidi="en-US"/>
-        </w:rPr>
-      </w:r>
     </w:p>
     <w:p>
       <w:pPr>
@@ -2444,7 +2448,6 @@
         </w:rPr>
         <w:t xml:space="preserve">2. Grafiek displayen (real-time of offline)</w:t>
       </w:r>
-      <w:r/>
       <w:r>
         <w:rPr>
           <w:highlight w:val="none"/>
@@ -2452,12 +2455,6 @@
         </w:rPr>
       </w:r>
       <w:r/>
-      <w:r>
-        <w:rPr>
-          <w:highlight w:val="none"/>
-          <w:lang w:val="en-US" w:bidi="en-US"/>
-        </w:rPr>
-      </w:r>
     </w:p>
     <w:p>
       <w:pPr>
@@ -2499,13 +2496,6 @@
           <w:lang w:val="en-US"/>
         </w:rPr>
       </w:pPr>
-      <w:r>
-        <w:rPr>
-          <w:highlight w:val="none"/>
-          <w:lang w:val="en-US" w:bidi="en-US"/>
-        </w:rPr>
-      </w:r>
-      <w:r/>
       <w:r>
         <w:rPr>
           <w:highlight w:val="none"/>
@@ -2520,8 +2510,7 @@
       </w:r>
       <w:r>
         <w:rPr>
-          <w:highlight w:val="none"/>
-          <w:lang w:val="en-US" w:bidi="en-US"/>
+          <w:lang w:val="en-US"/>
         </w:rPr>
       </w:r>
     </w:p>
@@ -2547,7 +2536,6 @@
         <w:ind/>
         <w:rPr/>
       </w:pPr>
-      <w:r/>
       <w:r>
         <w:separator/>
       </w:r>
@@ -2562,7 +2550,6 @@
         <w:ind/>
         <w:rPr/>
       </w:pPr>
-      <w:r/>
       <w:r>
         <w:continuationSeparator/>
       </w:r>
@@ -2582,7 +2569,6 @@
         <w:ind/>
         <w:rPr/>
       </w:pPr>
-      <w:r/>
       <w:r>
         <w:separator/>
       </w:r>
@@ -2597,7 +2583,6 @@
         <w:ind/>
         <w:rPr/>
       </w:pPr>
-      <w:r/>
       <w:r>
         <w:continuationSeparator/>
       </w:r>
@@ -6656,9 +6641,9 @@
     <w:lsdException w:name="Bibliography" w:uiPriority="37"/>
     <w:lsdException w:name="TOC Heading" w:uiPriority="39" w:qFormat="1"/>
   </w:latentStyles>
-  <w:style w:type="table" w:styleId="12">
+  <w:style w:type="table" w:styleId="746">
     <w:name w:val="Table Grid"/>
-    <w:basedOn w:val="720"/>
+    <w:basedOn w:val="927"/>
     <w:uiPriority w:val="59"/>
     <w:pPr>
       <w:pBdr/>
@@ -6855,9 +6840,9 @@
       </w:tcPr>
     </w:tblStylePr>
   </w:style>
-  <w:style w:type="table" w:styleId="13">
+  <w:style w:type="table" w:styleId="747">
     <w:name w:val="Table Grid Light"/>
-    <w:basedOn w:val="720"/>
+    <w:basedOn w:val="927"/>
     <w:uiPriority w:val="59"/>
     <w:pPr>
       <w:pBdr/>
@@ -7054,9 +7039,9 @@
       </w:tcPr>
     </w:tblStylePr>
   </w:style>
-  <w:style w:type="table" w:styleId="14">
+  <w:style w:type="table" w:styleId="748">
     <w:name w:val="Plain Table 1"/>
-    <w:basedOn w:val="720"/>
+    <w:basedOn w:val="927"/>
     <w:uiPriority w:val="59"/>
     <w:pPr>
       <w:pBdr/>
@@ -7279,9 +7264,9 @@
       </w:tcPr>
     </w:tblStylePr>
   </w:style>
-  <w:style w:type="table" w:styleId="15">
+  <w:style w:type="table" w:styleId="749">
     <w:name w:val="Plain Table 2"/>
-    <w:basedOn w:val="720"/>
+    <w:basedOn w:val="927"/>
     <w:uiPriority w:val="59"/>
     <w:pPr>
       <w:pBdr/>
@@ -7512,9 +7497,9 @@
       </w:tcPr>
     </w:tblStylePr>
   </w:style>
-  <w:style w:type="table" w:styleId="16">
+  <w:style w:type="table" w:styleId="750">
     <w:name w:val="Plain Table 3"/>
-    <w:basedOn w:val="720"/>
+    <w:basedOn w:val="927"/>
     <w:uiPriority w:val="99"/>
     <w:pPr>
       <w:pBdr/>
@@ -7742,9 +7727,9 @@
       </w:tcPr>
     </w:tblStylePr>
   </w:style>
-  <w:style w:type="table" w:styleId="17">
+  <w:style w:type="table" w:styleId="751">
     <w:name w:val="Plain Table 4"/>
-    <w:basedOn w:val="720"/>
+    <w:basedOn w:val="927"/>
     <w:uiPriority w:val="99"/>
     <w:pPr>
       <w:pBdr/>
@@ -7958,9 +7943,9 @@
       </w:tcPr>
     </w:tblStylePr>
   </w:style>
-  <w:style w:type="table" w:styleId="18">
+  <w:style w:type="table" w:styleId="752">
     <w:name w:val="Plain Table 5"/>
-    <w:basedOn w:val="720"/>
+    <w:basedOn w:val="927"/>
     <w:uiPriority w:val="99"/>
     <w:pPr>
       <w:pBdr/>
@@ -8191,9 +8176,9 @@
       </w:tcPr>
     </w:tblStylePr>
   </w:style>
-  <w:style w:type="table" w:styleId="19">
+  <w:style w:type="table" w:styleId="753">
     <w:name w:val="Grid Table 1 Light"/>
-    <w:basedOn w:val="720"/>
+    <w:basedOn w:val="927"/>
     <w:uiPriority w:val="99"/>
     <w:pPr>
       <w:pBdr/>
@@ -8414,9 +8399,9 @@
       </w:tcPr>
     </w:tblStylePr>
   </w:style>
-  <w:style w:type="table" w:styleId="20">
+  <w:style w:type="table" w:styleId="754">
     <w:name w:val="Grid Table 1 Light - Accent 1"/>
-    <w:basedOn w:val="720"/>
+    <w:basedOn w:val="927"/>
     <w:uiPriority w:val="99"/>
     <w:pPr>
       <w:pBdr/>
@@ -8637,9 +8622,9 @@
       </w:tcPr>
     </w:tblStylePr>
   </w:style>
-  <w:style w:type="table" w:styleId="21">
+  <w:style w:type="table" w:styleId="755">
     <w:name w:val="Grid Table 1 Light - Accent 2"/>
-    <w:basedOn w:val="720"/>
+    <w:basedOn w:val="927"/>
     <w:uiPriority w:val="99"/>
     <w:pPr>
       <w:pBdr/>
@@ -8860,9 +8845,9 @@
       </w:tcPr>
     </w:tblStylePr>
   </w:style>
-  <w:style w:type="table" w:styleId="22">
+  <w:style w:type="table" w:styleId="756">
     <w:name w:val="Grid Table 1 Light - Accent 3"/>
-    <w:basedOn w:val="720"/>
+    <w:basedOn w:val="927"/>
     <w:uiPriority w:val="99"/>
     <w:pPr>
       <w:pBdr/>
@@ -9083,9 +9068,9 @@
       </w:tcPr>
     </w:tblStylePr>
   </w:style>
-  <w:style w:type="table" w:styleId="23">
+  <w:style w:type="table" w:styleId="757">
     <w:name w:val="Grid Table 1 Light - Accent 4"/>
-    <w:basedOn w:val="720"/>
+    <w:basedOn w:val="927"/>
     <w:uiPriority w:val="99"/>
     <w:pPr>
       <w:pBdr/>
@@ -9306,9 +9291,9 @@
       </w:tcPr>
     </w:tblStylePr>
   </w:style>
-  <w:style w:type="table" w:styleId="24">
+  <w:style w:type="table" w:styleId="758">
     <w:name w:val="Grid Table 1 Light - Accent 5"/>
-    <w:basedOn w:val="720"/>
+    <w:basedOn w:val="927"/>
     <w:uiPriority w:val="99"/>
     <w:pPr>
       <w:pBdr/>
@@ -9529,9 +9514,9 @@
       </w:tcPr>
     </w:tblStylePr>
   </w:style>
-  <w:style w:type="table" w:styleId="25">
+  <w:style w:type="table" w:styleId="759">
     <w:name w:val="Grid Table 1 Light - Accent 6"/>
-    <w:basedOn w:val="720"/>
+    <w:basedOn w:val="927"/>
     <w:uiPriority w:val="99"/>
     <w:pPr>
       <w:pBdr/>
@@ -9752,9 +9737,9 @@
       </w:tcPr>
     </w:tblStylePr>
   </w:style>
-  <w:style w:type="table" w:styleId="26">
+  <w:style w:type="table" w:styleId="760">
     <w:name w:val="Grid Table 2"/>
-    <w:basedOn w:val="720"/>
+    <w:basedOn w:val="927"/>
     <w:uiPriority w:val="99"/>
     <w:pPr>
       <w:pBdr/>
@@ -9984,9 +9969,9 @@
       </w:tcPr>
     </w:tblStylePr>
   </w:style>
-  <w:style w:type="table" w:styleId="27">
+  <w:style w:type="table" w:styleId="761">
     <w:name w:val="Grid Table 2 - Accent 1"/>
-    <w:basedOn w:val="720"/>
+    <w:basedOn w:val="927"/>
     <w:uiPriority w:val="99"/>
     <w:pPr>
       <w:pBdr/>
@@ -10216,9 +10201,9 @@
       </w:tcPr>
     </w:tblStylePr>
   </w:style>
-  <w:style w:type="table" w:styleId="28">
+  <w:style w:type="table" w:styleId="762">
     <w:name w:val="Grid Table 2 - Accent 2"/>
-    <w:basedOn w:val="720"/>
+    <w:basedOn w:val="927"/>
     <w:uiPriority w:val="99"/>
     <w:pPr>
       <w:pBdr/>
@@ -10448,9 +10433,9 @@
       </w:tcPr>
     </w:tblStylePr>
   </w:style>
-  <w:style w:type="table" w:styleId="29">
+  <w:style w:type="table" w:styleId="763">
     <w:name w:val="Grid Table 2 - Accent 3"/>
-    <w:basedOn w:val="720"/>
+    <w:basedOn w:val="927"/>
     <w:uiPriority w:val="99"/>
     <w:pPr>
       <w:pBdr/>
@@ -10680,9 +10665,9 @@
       </w:tcPr>
     </w:tblStylePr>
   </w:style>
-  <w:style w:type="table" w:styleId="30">
+  <w:style w:type="table" w:styleId="764">
     <w:name w:val="Grid Table 2 - Accent 4"/>
-    <w:basedOn w:val="720"/>
+    <w:basedOn w:val="927"/>
     <w:uiPriority w:val="99"/>
     <w:pPr>
       <w:pBdr/>
@@ -10912,9 +10897,9 @@
       </w:tcPr>
     </w:tblStylePr>
   </w:style>
-  <w:style w:type="table" w:styleId="31">
+  <w:style w:type="table" w:styleId="765">
     <w:name w:val="Grid Table 2 - Accent 5"/>
-    <w:basedOn w:val="720"/>
+    <w:basedOn w:val="927"/>
     <w:uiPriority w:val="99"/>
     <w:pPr>
       <w:pBdr/>
@@ -11144,9 +11129,9 @@
       </w:tcPr>
     </w:tblStylePr>
   </w:style>
-  <w:style w:type="table" w:styleId="32">
+  <w:style w:type="table" w:styleId="766">
     <w:name w:val="Grid Table 2 - Accent 6"/>
-    <w:basedOn w:val="720"/>
+    <w:basedOn w:val="927"/>
     <w:uiPriority w:val="99"/>
     <w:pPr>
       <w:pBdr/>
@@ -11376,9 +11361,9 @@
       </w:tcPr>
     </w:tblStylePr>
   </w:style>
-  <w:style w:type="table" w:styleId="33">
+  <w:style w:type="table" w:styleId="767">
     <w:name w:val="Grid Table 3"/>
-    <w:basedOn w:val="720"/>
+    <w:basedOn w:val="927"/>
     <w:uiPriority w:val="99"/>
     <w:pPr>
       <w:pBdr/>
@@ -11477,29 +11462,6 @@
         <w:tblBorders/>
       </w:tblPr>
       <w:tcPr>
-        <w:shd w:color="ffffff"/>
-        <w:tcBorders>
-          <w:top w:val="none" w:color="000000" w:sz="4" w:space="0"/>
-          <w:left w:val="none" w:color="000000" w:sz="4" w:space="0"/>
-          <w:bottom w:val="none" w:color="000000" w:sz="4" w:space="0"/>
-          <w:right w:val="none" w:color="000000" w:sz="4" w:space="0"/>
-        </w:tcBorders>
-      </w:tcPr>
-    </w:tblStylePr>
-    <w:tblStylePr w:type="firstRow">
-      <w:rPr>
-        <w:b/>
-        <w:color w:val="404040"/>
-      </w:rPr>
-      <w:pPr>
-        <w:pBdr/>
-        <w:spacing/>
-        <w:ind/>
-      </w:pPr>
-      <w:tblPr>
-        <w:tblBorders/>
-      </w:tblPr>
-      <w:tcPr>
         <w:shd w:val="clear" w:color="ffffff"/>
         <w:tcBorders>
           <w:top w:val="none" w:color="000000" w:sz="4" w:space="0"/>
@@ -11509,30 +11471,7 @@
         </w:tcBorders>
       </w:tcPr>
     </w:tblStylePr>
-    <w:tblStylePr w:type="lastCol">
-      <w:rPr>
-        <w:i/>
-        <w:color w:val="404040"/>
-      </w:rPr>
-      <w:pPr>
-        <w:pBdr/>
-        <w:spacing/>
-        <w:ind/>
-      </w:pPr>
-      <w:tblPr>
-        <w:tblBorders/>
-      </w:tblPr>
-      <w:tcPr>
-        <w:shd w:color="ffffff"/>
-        <w:tcBorders>
-          <w:top w:val="none" w:color="000000" w:sz="4" w:space="0"/>
-          <w:left w:val="none" w:color="000000" w:sz="4" w:space="0"/>
-          <w:bottom w:val="none" w:color="000000" w:sz="4" w:space="0"/>
-          <w:right w:val="none" w:color="000000" w:sz="4" w:space="0"/>
-        </w:tcBorders>
-      </w:tcPr>
-    </w:tblStylePr>
-    <w:tblStylePr w:type="lastRow">
+    <w:tblStylePr w:type="firstRow">
       <w:rPr>
         <w:b/>
         <w:color w:val="404040"/>
@@ -11555,6 +11494,52 @@
         </w:tcBorders>
       </w:tcPr>
     </w:tblStylePr>
+    <w:tblStylePr w:type="lastCol">
+      <w:rPr>
+        <w:i/>
+        <w:color w:val="404040"/>
+      </w:rPr>
+      <w:pPr>
+        <w:pBdr/>
+        <w:spacing/>
+        <w:ind/>
+      </w:pPr>
+      <w:tblPr>
+        <w:tblBorders/>
+      </w:tblPr>
+      <w:tcPr>
+        <w:shd w:val="clear" w:color="ffffff"/>
+        <w:tcBorders>
+          <w:top w:val="none" w:color="000000" w:sz="4" w:space="0"/>
+          <w:left w:val="none" w:color="000000" w:sz="4" w:space="0"/>
+          <w:bottom w:val="none" w:color="000000" w:sz="4" w:space="0"/>
+          <w:right w:val="none" w:color="000000" w:sz="4" w:space="0"/>
+        </w:tcBorders>
+      </w:tcPr>
+    </w:tblStylePr>
+    <w:tblStylePr w:type="lastRow">
+      <w:rPr>
+        <w:b/>
+        <w:color w:val="404040"/>
+      </w:rPr>
+      <w:pPr>
+        <w:pBdr/>
+        <w:spacing/>
+        <w:ind/>
+      </w:pPr>
+      <w:tblPr>
+        <w:tblBorders/>
+      </w:tblPr>
+      <w:tcPr>
+        <w:shd w:val="clear" w:color="ffffff"/>
+        <w:tcBorders>
+          <w:top w:val="none" w:color="000000" w:sz="4" w:space="0"/>
+          <w:left w:val="none" w:color="000000" w:sz="4" w:space="0"/>
+          <w:bottom w:val="none" w:color="000000" w:sz="4" w:space="0"/>
+          <w:right w:val="none" w:color="000000" w:sz="4" w:space="0"/>
+        </w:tcBorders>
+      </w:tcPr>
+    </w:tblStylePr>
     <w:tblStylePr w:type="nwCell">
       <w:pPr>
         <w:pBdr/>
@@ -11621,9 +11606,9 @@
       </w:tcPr>
     </w:tblStylePr>
   </w:style>
-  <w:style w:type="table" w:styleId="34">
+  <w:style w:type="table" w:styleId="768">
     <w:name w:val="Grid Table 3 - Accent 1"/>
-    <w:basedOn w:val="720"/>
+    <w:basedOn w:val="927"/>
     <w:uiPriority w:val="99"/>
     <w:pPr>
       <w:pBdr/>
@@ -11722,29 +11707,6 @@
         <w:tblBorders/>
       </w:tblPr>
       <w:tcPr>
-        <w:shd w:color="ffffff"/>
-        <w:tcBorders>
-          <w:top w:val="none" w:color="000000" w:sz="4" w:space="0"/>
-          <w:left w:val="none" w:color="000000" w:sz="4" w:space="0"/>
-          <w:bottom w:val="none" w:color="000000" w:sz="4" w:space="0"/>
-          <w:right w:val="none" w:color="000000" w:sz="4" w:space="0"/>
-        </w:tcBorders>
-      </w:tcPr>
-    </w:tblStylePr>
-    <w:tblStylePr w:type="firstRow">
-      <w:rPr>
-        <w:b/>
-        <w:color w:val="404040"/>
-      </w:rPr>
-      <w:pPr>
-        <w:pBdr/>
-        <w:spacing/>
-        <w:ind/>
-      </w:pPr>
-      <w:tblPr>
-        <w:tblBorders/>
-      </w:tblPr>
-      <w:tcPr>
         <w:shd w:val="clear" w:color="ffffff"/>
         <w:tcBorders>
           <w:top w:val="none" w:color="000000" w:sz="4" w:space="0"/>
@@ -11754,30 +11716,7 @@
         </w:tcBorders>
       </w:tcPr>
     </w:tblStylePr>
-    <w:tblStylePr w:type="lastCol">
-      <w:rPr>
-        <w:i/>
-        <w:color w:val="404040"/>
-      </w:rPr>
-      <w:pPr>
-        <w:pBdr/>
-        <w:spacing/>
-        <w:ind/>
-      </w:pPr>
-      <w:tblPr>
-        <w:tblBorders/>
-      </w:tblPr>
-      <w:tcPr>
-        <w:shd w:color="ffffff"/>
-        <w:tcBorders>
-          <w:top w:val="none" w:color="000000" w:sz="4" w:space="0"/>
-          <w:left w:val="none" w:color="000000" w:sz="4" w:space="0"/>
-          <w:bottom w:val="none" w:color="000000" w:sz="4" w:space="0"/>
-          <w:right w:val="none" w:color="000000" w:sz="4" w:space="0"/>
-        </w:tcBorders>
-      </w:tcPr>
-    </w:tblStylePr>
-    <w:tblStylePr w:type="lastRow">
+    <w:tblStylePr w:type="firstRow">
       <w:rPr>
         <w:b/>
         <w:color w:val="404040"/>
@@ -11800,6 +11739,52 @@
         </w:tcBorders>
       </w:tcPr>
     </w:tblStylePr>
+    <w:tblStylePr w:type="lastCol">
+      <w:rPr>
+        <w:i/>
+        <w:color w:val="404040"/>
+      </w:rPr>
+      <w:pPr>
+        <w:pBdr/>
+        <w:spacing/>
+        <w:ind/>
+      </w:pPr>
+      <w:tblPr>
+        <w:tblBorders/>
+      </w:tblPr>
+      <w:tcPr>
+        <w:shd w:val="clear" w:color="ffffff"/>
+        <w:tcBorders>
+          <w:top w:val="none" w:color="000000" w:sz="4" w:space="0"/>
+          <w:left w:val="none" w:color="000000" w:sz="4" w:space="0"/>
+          <w:bottom w:val="none" w:color="000000" w:sz="4" w:space="0"/>
+          <w:right w:val="none" w:color="000000" w:sz="4" w:space="0"/>
+        </w:tcBorders>
+      </w:tcPr>
+    </w:tblStylePr>
+    <w:tblStylePr w:type="lastRow">
+      <w:rPr>
+        <w:b/>
+        <w:color w:val="404040"/>
+      </w:rPr>
+      <w:pPr>
+        <w:pBdr/>
+        <w:spacing/>
+        <w:ind/>
+      </w:pPr>
+      <w:tblPr>
+        <w:tblBorders/>
+      </w:tblPr>
+      <w:tcPr>
+        <w:shd w:val="clear" w:color="ffffff"/>
+        <w:tcBorders>
+          <w:top w:val="none" w:color="000000" w:sz="4" w:space="0"/>
+          <w:left w:val="none" w:color="000000" w:sz="4" w:space="0"/>
+          <w:bottom w:val="none" w:color="000000" w:sz="4" w:space="0"/>
+          <w:right w:val="none" w:color="000000" w:sz="4" w:space="0"/>
+        </w:tcBorders>
+      </w:tcPr>
+    </w:tblStylePr>
     <w:tblStylePr w:type="nwCell">
       <w:pPr>
         <w:pBdr/>
@@ -11866,9 +11851,9 @@
       </w:tcPr>
     </w:tblStylePr>
   </w:style>
-  <w:style w:type="table" w:styleId="35">
+  <w:style w:type="table" w:styleId="769">
     <w:name w:val="Grid Table 3 - Accent 2"/>
-    <w:basedOn w:val="720"/>
+    <w:basedOn w:val="927"/>
     <w:uiPriority w:val="99"/>
     <w:pPr>
       <w:pBdr/>
@@ -11967,29 +11952,6 @@
         <w:tblBorders/>
       </w:tblPr>
       <w:tcPr>
-        <w:shd w:color="ffffff"/>
-        <w:tcBorders>
-          <w:top w:val="none" w:color="000000" w:sz="4" w:space="0"/>
-          <w:left w:val="none" w:color="000000" w:sz="4" w:space="0"/>
-          <w:bottom w:val="none" w:color="000000" w:sz="4" w:space="0"/>
-          <w:right w:val="none" w:color="000000" w:sz="4" w:space="0"/>
-        </w:tcBorders>
-      </w:tcPr>
-    </w:tblStylePr>
-    <w:tblStylePr w:type="firstRow">
-      <w:rPr>
-        <w:b/>
-        <w:color w:val="404040"/>
-      </w:rPr>
-      <w:pPr>
-        <w:pBdr/>
-        <w:spacing/>
-        <w:ind/>
-      </w:pPr>
-      <w:tblPr>
-        <w:tblBorders/>
-      </w:tblPr>
-      <w:tcPr>
         <w:shd w:val="clear" w:color="ffffff"/>
         <w:tcBorders>
           <w:top w:val="none" w:color="000000" w:sz="4" w:space="0"/>
@@ -11999,30 +11961,7 @@
         </w:tcBorders>
       </w:tcPr>
     </w:tblStylePr>
-    <w:tblStylePr w:type="lastCol">
-      <w:rPr>
-        <w:i/>
-        <w:color w:val="404040"/>
-      </w:rPr>
-      <w:pPr>
-        <w:pBdr/>
-        <w:spacing/>
-        <w:ind/>
-      </w:pPr>
-      <w:tblPr>
-        <w:tblBorders/>
-      </w:tblPr>
-      <w:tcPr>
-        <w:shd w:color="ffffff"/>
-        <w:tcBorders>
-          <w:top w:val="none" w:color="000000" w:sz="4" w:space="0"/>
-          <w:left w:val="none" w:color="000000" w:sz="4" w:space="0"/>
-          <w:bottom w:val="none" w:color="000000" w:sz="4" w:space="0"/>
-          <w:right w:val="none" w:color="000000" w:sz="4" w:space="0"/>
-        </w:tcBorders>
-      </w:tcPr>
-    </w:tblStylePr>
-    <w:tblStylePr w:type="lastRow">
+    <w:tblStylePr w:type="firstRow">
       <w:rPr>
         <w:b/>
         <w:color w:val="404040"/>
@@ -12045,6 +11984,52 @@
         </w:tcBorders>
       </w:tcPr>
     </w:tblStylePr>
+    <w:tblStylePr w:type="lastCol">
+      <w:rPr>
+        <w:i/>
+        <w:color w:val="404040"/>
+      </w:rPr>
+      <w:pPr>
+        <w:pBdr/>
+        <w:spacing/>
+        <w:ind/>
+      </w:pPr>
+      <w:tblPr>
+        <w:tblBorders/>
+      </w:tblPr>
+      <w:tcPr>
+        <w:shd w:val="clear" w:color="ffffff"/>
+        <w:tcBorders>
+          <w:top w:val="none" w:color="000000" w:sz="4" w:space="0"/>
+          <w:left w:val="none" w:color="000000" w:sz="4" w:space="0"/>
+          <w:bottom w:val="none" w:color="000000" w:sz="4" w:space="0"/>
+          <w:right w:val="none" w:color="000000" w:sz="4" w:space="0"/>
+        </w:tcBorders>
+      </w:tcPr>
+    </w:tblStylePr>
+    <w:tblStylePr w:type="lastRow">
+      <w:rPr>
+        <w:b/>
+        <w:color w:val="404040"/>
+      </w:rPr>
+      <w:pPr>
+        <w:pBdr/>
+        <w:spacing/>
+        <w:ind/>
+      </w:pPr>
+      <w:tblPr>
+        <w:tblBorders/>
+      </w:tblPr>
+      <w:tcPr>
+        <w:shd w:val="clear" w:color="ffffff"/>
+        <w:tcBorders>
+          <w:top w:val="none" w:color="000000" w:sz="4" w:space="0"/>
+          <w:left w:val="none" w:color="000000" w:sz="4" w:space="0"/>
+          <w:bottom w:val="none" w:color="000000" w:sz="4" w:space="0"/>
+          <w:right w:val="none" w:color="000000" w:sz="4" w:space="0"/>
+        </w:tcBorders>
+      </w:tcPr>
+    </w:tblStylePr>
     <w:tblStylePr w:type="nwCell">
       <w:pPr>
         <w:pBdr/>
@@ -12111,9 +12096,9 @@
       </w:tcPr>
     </w:tblStylePr>
   </w:style>
-  <w:style w:type="table" w:styleId="36">
+  <w:style w:type="table" w:styleId="770">
     <w:name w:val="Grid Table 3 - Accent 3"/>
-    <w:basedOn w:val="720"/>
+    <w:basedOn w:val="927"/>
     <w:uiPriority w:val="99"/>
     <w:pPr>
       <w:pBdr/>
@@ -12212,29 +12197,6 @@
         <w:tblBorders/>
       </w:tblPr>
       <w:tcPr>
-        <w:shd w:color="ffffff"/>
-        <w:tcBorders>
-          <w:top w:val="none" w:color="000000" w:sz="4" w:space="0"/>
-          <w:left w:val="none" w:color="000000" w:sz="4" w:space="0"/>
-          <w:bottom w:val="none" w:color="000000" w:sz="4" w:space="0"/>
-          <w:right w:val="none" w:color="000000" w:sz="4" w:space="0"/>
-        </w:tcBorders>
-      </w:tcPr>
-    </w:tblStylePr>
-    <w:tblStylePr w:type="firstRow">
-      <w:rPr>
-        <w:b/>
-        <w:color w:val="404040"/>
-      </w:rPr>
-      <w:pPr>
-        <w:pBdr/>
-        <w:spacing/>
-        <w:ind/>
-      </w:pPr>
-      <w:tblPr>
-        <w:tblBorders/>
-      </w:tblPr>
-      <w:tcPr>
         <w:shd w:val="clear" w:color="ffffff"/>
         <w:tcBorders>
           <w:top w:val="none" w:color="000000" w:sz="4" w:space="0"/>
@@ -12244,30 +12206,7 @@
         </w:tcBorders>
       </w:tcPr>
     </w:tblStylePr>
-    <w:tblStylePr w:type="lastCol">
-      <w:rPr>
-        <w:i/>
-        <w:color w:val="404040"/>
-      </w:rPr>
-      <w:pPr>
-        <w:pBdr/>
-        <w:spacing/>
-        <w:ind/>
-      </w:pPr>
-      <w:tblPr>
-        <w:tblBorders/>
-      </w:tblPr>
-      <w:tcPr>
-        <w:shd w:color="ffffff"/>
-        <w:tcBorders>
-          <w:top w:val="none" w:color="000000" w:sz="4" w:space="0"/>
-          <w:left w:val="none" w:color="000000" w:sz="4" w:space="0"/>
-          <w:bottom w:val="none" w:color="000000" w:sz="4" w:space="0"/>
-          <w:right w:val="none" w:color="000000" w:sz="4" w:space="0"/>
-        </w:tcBorders>
-      </w:tcPr>
-    </w:tblStylePr>
-    <w:tblStylePr w:type="lastRow">
+    <w:tblStylePr w:type="firstRow">
       <w:rPr>
         <w:b/>
         <w:color w:val="404040"/>
@@ -12290,6 +12229,52 @@
         </w:tcBorders>
       </w:tcPr>
     </w:tblStylePr>
+    <w:tblStylePr w:type="lastCol">
+      <w:rPr>
+        <w:i/>
+        <w:color w:val="404040"/>
+      </w:rPr>
+      <w:pPr>
+        <w:pBdr/>
+        <w:spacing/>
+        <w:ind/>
+      </w:pPr>
+      <w:tblPr>
+        <w:tblBorders/>
+      </w:tblPr>
+      <w:tcPr>
+        <w:shd w:val="clear" w:color="ffffff"/>
+        <w:tcBorders>
+          <w:top w:val="none" w:color="000000" w:sz="4" w:space="0"/>
+          <w:left w:val="none" w:color="000000" w:sz="4" w:space="0"/>
+          <w:bottom w:val="none" w:color="000000" w:sz="4" w:space="0"/>
+          <w:right w:val="none" w:color="000000" w:sz="4" w:space="0"/>
+        </w:tcBorders>
+      </w:tcPr>
+    </w:tblStylePr>
+    <w:tblStylePr w:type="lastRow">
+      <w:rPr>
+        <w:b/>
+        <w:color w:val="404040"/>
+      </w:rPr>
+      <w:pPr>
+        <w:pBdr/>
+        <w:spacing/>
+        <w:ind/>
+      </w:pPr>
+      <w:tblPr>
+        <w:tblBorders/>
+      </w:tblPr>
+      <w:tcPr>
+        <w:shd w:val="clear" w:color="ffffff"/>
+        <w:tcBorders>
+          <w:top w:val="none" w:color="000000" w:sz="4" w:space="0"/>
+          <w:left w:val="none" w:color="000000" w:sz="4" w:space="0"/>
+          <w:bottom w:val="none" w:color="000000" w:sz="4" w:space="0"/>
+          <w:right w:val="none" w:color="000000" w:sz="4" w:space="0"/>
+        </w:tcBorders>
+      </w:tcPr>
+    </w:tblStylePr>
     <w:tblStylePr w:type="nwCell">
       <w:pPr>
         <w:pBdr/>
@@ -12356,9 +12341,9 @@
       </w:tcPr>
     </w:tblStylePr>
   </w:style>
-  <w:style w:type="table" w:styleId="37">
+  <w:style w:type="table" w:styleId="771">
     <w:name w:val="Grid Table 3 - Accent 4"/>
-    <w:basedOn w:val="720"/>
+    <w:basedOn w:val="927"/>
     <w:uiPriority w:val="99"/>
     <w:pPr>
       <w:pBdr/>
@@ -12457,29 +12442,6 @@
         <w:tblBorders/>
       </w:tblPr>
       <w:tcPr>
-        <w:shd w:color="ffffff"/>
-        <w:tcBorders>
-          <w:top w:val="none" w:color="000000" w:sz="4" w:space="0"/>
-          <w:left w:val="none" w:color="000000" w:sz="4" w:space="0"/>
-          <w:bottom w:val="none" w:color="000000" w:sz="4" w:space="0"/>
-          <w:right w:val="none" w:color="000000" w:sz="4" w:space="0"/>
-        </w:tcBorders>
-      </w:tcPr>
-    </w:tblStylePr>
-    <w:tblStylePr w:type="firstRow">
-      <w:rPr>
-        <w:b/>
-        <w:color w:val="404040"/>
-      </w:rPr>
-      <w:pPr>
-        <w:pBdr/>
-        <w:spacing/>
-        <w:ind/>
-      </w:pPr>
-      <w:tblPr>
-        <w:tblBorders/>
-      </w:tblPr>
-      <w:tcPr>
         <w:shd w:val="clear" w:color="ffffff"/>
         <w:tcBorders>
           <w:top w:val="none" w:color="000000" w:sz="4" w:space="0"/>
@@ -12489,30 +12451,7 @@
         </w:tcBorders>
       </w:tcPr>
     </w:tblStylePr>
-    <w:tblStylePr w:type="lastCol">
-      <w:rPr>
-        <w:i/>
-        <w:color w:val="404040"/>
-      </w:rPr>
-      <w:pPr>
-        <w:pBdr/>
-        <w:spacing/>
-        <w:ind/>
-      </w:pPr>
-      <w:tblPr>
-        <w:tblBorders/>
-      </w:tblPr>
-      <w:tcPr>
-        <w:shd w:color="ffffff"/>
-        <w:tcBorders>
-          <w:top w:val="none" w:color="000000" w:sz="4" w:space="0"/>
-          <w:left w:val="none" w:color="000000" w:sz="4" w:space="0"/>
-          <w:bottom w:val="none" w:color="000000" w:sz="4" w:space="0"/>
-          <w:right w:val="none" w:color="000000" w:sz="4" w:space="0"/>
-        </w:tcBorders>
-      </w:tcPr>
-    </w:tblStylePr>
-    <w:tblStylePr w:type="lastRow">
+    <w:tblStylePr w:type="firstRow">
       <w:rPr>
         <w:b/>
         <w:color w:val="404040"/>
@@ -12535,6 +12474,52 @@
         </w:tcBorders>
       </w:tcPr>
     </w:tblStylePr>
+    <w:tblStylePr w:type="lastCol">
+      <w:rPr>
+        <w:i/>
+        <w:color w:val="404040"/>
+      </w:rPr>
+      <w:pPr>
+        <w:pBdr/>
+        <w:spacing/>
+        <w:ind/>
+      </w:pPr>
+      <w:tblPr>
+        <w:tblBorders/>
+      </w:tblPr>
+      <w:tcPr>
+        <w:shd w:val="clear" w:color="ffffff"/>
+        <w:tcBorders>
+          <w:top w:val="none" w:color="000000" w:sz="4" w:space="0"/>
+          <w:left w:val="none" w:color="000000" w:sz="4" w:space="0"/>
+          <w:bottom w:val="none" w:color="000000" w:sz="4" w:space="0"/>
+          <w:right w:val="none" w:color="000000" w:sz="4" w:space="0"/>
+        </w:tcBorders>
+      </w:tcPr>
+    </w:tblStylePr>
+    <w:tblStylePr w:type="lastRow">
+      <w:rPr>
+        <w:b/>
+        <w:color w:val="404040"/>
+      </w:rPr>
+      <w:pPr>
+        <w:pBdr/>
+        <w:spacing/>
+        <w:ind/>
+      </w:pPr>
+      <w:tblPr>
+        <w:tblBorders/>
+      </w:tblPr>
+      <w:tcPr>
+        <w:shd w:val="clear" w:color="ffffff"/>
+        <w:tcBorders>
+          <w:top w:val="none" w:color="000000" w:sz="4" w:space="0"/>
+          <w:left w:val="none" w:color="000000" w:sz="4" w:space="0"/>
+          <w:bottom w:val="none" w:color="000000" w:sz="4" w:space="0"/>
+          <w:right w:val="none" w:color="000000" w:sz="4" w:space="0"/>
+        </w:tcBorders>
+      </w:tcPr>
+    </w:tblStylePr>
     <w:tblStylePr w:type="nwCell">
       <w:pPr>
         <w:pBdr/>
@@ -12601,9 +12586,9 @@
       </w:tcPr>
     </w:tblStylePr>
   </w:style>
-  <w:style w:type="table" w:styleId="38">
+  <w:style w:type="table" w:styleId="772">
     <w:name w:val="Grid Table 3 - Accent 5"/>
-    <w:basedOn w:val="720"/>
+    <w:basedOn w:val="927"/>
     <w:uiPriority w:val="99"/>
     <w:pPr>
       <w:pBdr/>
@@ -12702,29 +12687,6 @@
         <w:tblBorders/>
       </w:tblPr>
       <w:tcPr>
-        <w:shd w:color="ffffff"/>
-        <w:tcBorders>
-          <w:top w:val="none" w:color="000000" w:sz="4" w:space="0"/>
-          <w:left w:val="none" w:color="000000" w:sz="4" w:space="0"/>
-          <w:bottom w:val="none" w:color="000000" w:sz="4" w:space="0"/>
-          <w:right w:val="none" w:color="000000" w:sz="4" w:space="0"/>
-        </w:tcBorders>
-      </w:tcPr>
-    </w:tblStylePr>
-    <w:tblStylePr w:type="firstRow">
-      <w:rPr>
-        <w:b/>
-        <w:color w:val="404040"/>
-      </w:rPr>
-      <w:pPr>
-        <w:pBdr/>
-        <w:spacing/>
-        <w:ind/>
-      </w:pPr>
-      <w:tblPr>
-        <w:tblBorders/>
-      </w:tblPr>
-      <w:tcPr>
         <w:shd w:val="clear" w:color="ffffff"/>
         <w:tcBorders>
           <w:top w:val="none" w:color="000000" w:sz="4" w:space="0"/>
@@ -12734,30 +12696,7 @@
         </w:tcBorders>
       </w:tcPr>
     </w:tblStylePr>
-    <w:tblStylePr w:type="lastCol">
-      <w:rPr>
-        <w:i/>
-        <w:color w:val="404040"/>
-      </w:rPr>
-      <w:pPr>
-        <w:pBdr/>
-        <w:spacing/>
-        <w:ind/>
-      </w:pPr>
-      <w:tblPr>
-        <w:tblBorders/>
-      </w:tblPr>
-      <w:tcPr>
-        <w:shd w:color="ffffff"/>
-        <w:tcBorders>
-          <w:top w:val="none" w:color="000000" w:sz="4" w:space="0"/>
-          <w:left w:val="none" w:color="000000" w:sz="4" w:space="0"/>
-          <w:bottom w:val="none" w:color="000000" w:sz="4" w:space="0"/>
-          <w:right w:val="none" w:color="000000" w:sz="4" w:space="0"/>
-        </w:tcBorders>
-      </w:tcPr>
-    </w:tblStylePr>
-    <w:tblStylePr w:type="lastRow">
+    <w:tblStylePr w:type="firstRow">
       <w:rPr>
         <w:b/>
         <w:color w:val="404040"/>
@@ -12780,6 +12719,52 @@
         </w:tcBorders>
       </w:tcPr>
     </w:tblStylePr>
+    <w:tblStylePr w:type="lastCol">
+      <w:rPr>
+        <w:i/>
+        <w:color w:val="404040"/>
+      </w:rPr>
+      <w:pPr>
+        <w:pBdr/>
+        <w:spacing/>
+        <w:ind/>
+      </w:pPr>
+      <w:tblPr>
+        <w:tblBorders/>
+      </w:tblPr>
+      <w:tcPr>
+        <w:shd w:val="clear" w:color="ffffff"/>
+        <w:tcBorders>
+          <w:top w:val="none" w:color="000000" w:sz="4" w:space="0"/>
+          <w:left w:val="none" w:color="000000" w:sz="4" w:space="0"/>
+          <w:bottom w:val="none" w:color="000000" w:sz="4" w:space="0"/>
+          <w:right w:val="none" w:color="000000" w:sz="4" w:space="0"/>
+        </w:tcBorders>
+      </w:tcPr>
+    </w:tblStylePr>
+    <w:tblStylePr w:type="lastRow">
+      <w:rPr>
+        <w:b/>
+        <w:color w:val="404040"/>
+      </w:rPr>
+      <w:pPr>
+        <w:pBdr/>
+        <w:spacing/>
+        <w:ind/>
+      </w:pPr>
+      <w:tblPr>
+        <w:tblBorders/>
+      </w:tblPr>
+      <w:tcPr>
+        <w:shd w:val="clear" w:color="ffffff"/>
+        <w:tcBorders>
+          <w:top w:val="none" w:color="000000" w:sz="4" w:space="0"/>
+          <w:left w:val="none" w:color="000000" w:sz="4" w:space="0"/>
+          <w:bottom w:val="none" w:color="000000" w:sz="4" w:space="0"/>
+          <w:right w:val="none" w:color="000000" w:sz="4" w:space="0"/>
+        </w:tcBorders>
+      </w:tcPr>
+    </w:tblStylePr>
     <w:tblStylePr w:type="nwCell">
       <w:pPr>
         <w:pBdr/>
@@ -12846,9 +12831,9 @@
       </w:tcPr>
     </w:tblStylePr>
   </w:style>
-  <w:style w:type="table" w:styleId="39">
+  <w:style w:type="table" w:styleId="773">
     <w:name w:val="Grid Table 3 - Accent 6"/>
-    <w:basedOn w:val="720"/>
+    <w:basedOn w:val="927"/>
     <w:uiPriority w:val="99"/>
     <w:pPr>
       <w:pBdr/>
@@ -12947,29 +12932,6 @@
         <w:tblBorders/>
       </w:tblPr>
       <w:tcPr>
-        <w:shd w:color="ffffff"/>
-        <w:tcBorders>
-          <w:top w:val="none" w:color="000000" w:sz="4" w:space="0"/>
-          <w:left w:val="none" w:color="000000" w:sz="4" w:space="0"/>
-          <w:bottom w:val="none" w:color="000000" w:sz="4" w:space="0"/>
-          <w:right w:val="none" w:color="000000" w:sz="4" w:space="0"/>
-        </w:tcBorders>
-      </w:tcPr>
-    </w:tblStylePr>
-    <w:tblStylePr w:type="firstRow">
-      <w:rPr>
-        <w:b/>
-        <w:color w:val="404040"/>
-      </w:rPr>
-      <w:pPr>
-        <w:pBdr/>
-        <w:spacing/>
-        <w:ind/>
-      </w:pPr>
-      <w:tblPr>
-        <w:tblBorders/>
-      </w:tblPr>
-      <w:tcPr>
         <w:shd w:val="clear" w:color="ffffff"/>
         <w:tcBorders>
           <w:top w:val="none" w:color="000000" w:sz="4" w:space="0"/>
@@ -12979,30 +12941,7 @@
         </w:tcBorders>
       </w:tcPr>
     </w:tblStylePr>
-    <w:tblStylePr w:type="lastCol">
-      <w:rPr>
-        <w:i/>
-        <w:color w:val="404040"/>
-      </w:rPr>
-      <w:pPr>
-        <w:pBdr/>
-        <w:spacing/>
-        <w:ind/>
-      </w:pPr>
-      <w:tblPr>
-        <w:tblBorders/>
-      </w:tblPr>
-      <w:tcPr>
-        <w:shd w:color="ffffff"/>
-        <w:tcBorders>
-          <w:top w:val="none" w:color="000000" w:sz="4" w:space="0"/>
-          <w:left w:val="none" w:color="000000" w:sz="4" w:space="0"/>
-          <w:bottom w:val="none" w:color="000000" w:sz="4" w:space="0"/>
-          <w:right w:val="none" w:color="000000" w:sz="4" w:space="0"/>
-        </w:tcBorders>
-      </w:tcPr>
-    </w:tblStylePr>
-    <w:tblStylePr w:type="lastRow">
+    <w:tblStylePr w:type="firstRow">
       <w:rPr>
         <w:b/>
         <w:color w:val="404040"/>
@@ -13025,6 +12964,52 @@
         </w:tcBorders>
       </w:tcPr>
     </w:tblStylePr>
+    <w:tblStylePr w:type="lastCol">
+      <w:rPr>
+        <w:i/>
+        <w:color w:val="404040"/>
+      </w:rPr>
+      <w:pPr>
+        <w:pBdr/>
+        <w:spacing/>
+        <w:ind/>
+      </w:pPr>
+      <w:tblPr>
+        <w:tblBorders/>
+      </w:tblPr>
+      <w:tcPr>
+        <w:shd w:val="clear" w:color="ffffff"/>
+        <w:tcBorders>
+          <w:top w:val="none" w:color="000000" w:sz="4" w:space="0"/>
+          <w:left w:val="none" w:color="000000" w:sz="4" w:space="0"/>
+          <w:bottom w:val="none" w:color="000000" w:sz="4" w:space="0"/>
+          <w:right w:val="none" w:color="000000" w:sz="4" w:space="0"/>
+        </w:tcBorders>
+      </w:tcPr>
+    </w:tblStylePr>
+    <w:tblStylePr w:type="lastRow">
+      <w:rPr>
+        <w:b/>
+        <w:color w:val="404040"/>
+      </w:rPr>
+      <w:pPr>
+        <w:pBdr/>
+        <w:spacing/>
+        <w:ind/>
+      </w:pPr>
+      <w:tblPr>
+        <w:tblBorders/>
+      </w:tblPr>
+      <w:tcPr>
+        <w:shd w:val="clear" w:color="ffffff"/>
+        <w:tcBorders>
+          <w:top w:val="none" w:color="000000" w:sz="4" w:space="0"/>
+          <w:left w:val="none" w:color="000000" w:sz="4" w:space="0"/>
+          <w:bottom w:val="none" w:color="000000" w:sz="4" w:space="0"/>
+          <w:right w:val="none" w:color="000000" w:sz="4" w:space="0"/>
+        </w:tcBorders>
+      </w:tcPr>
+    </w:tblStylePr>
     <w:tblStylePr w:type="nwCell">
       <w:pPr>
         <w:pBdr/>
@@ -13091,9 +13076,9 @@
       </w:tcPr>
     </w:tblStylePr>
   </w:style>
-  <w:style w:type="table" w:styleId="40">
+  <w:style w:type="table" w:styleId="774">
     <w:name w:val="Grid Table 4"/>
-    <w:basedOn w:val="720"/>
+    <w:basedOn w:val="927"/>
     <w:uiPriority w:val="59"/>
     <w:pPr>
       <w:pBdr/>
@@ -13324,9 +13309,9 @@
       </w:tcPr>
     </w:tblStylePr>
   </w:style>
-  <w:style w:type="table" w:styleId="41">
+  <w:style w:type="table" w:styleId="775">
     <w:name w:val="Grid Table 4 - Accent 1"/>
-    <w:basedOn w:val="720"/>
+    <w:basedOn w:val="927"/>
     <w:uiPriority w:val="59"/>
     <w:pPr>
       <w:pBdr/>
@@ -13557,9 +13542,9 @@
       </w:tcPr>
     </w:tblStylePr>
   </w:style>
-  <w:style w:type="table" w:styleId="42">
+  <w:style w:type="table" w:styleId="776">
     <w:name w:val="Grid Table 4 - Accent 2"/>
-    <w:basedOn w:val="720"/>
+    <w:basedOn w:val="927"/>
     <w:uiPriority w:val="59"/>
     <w:pPr>
       <w:pBdr/>
@@ -13790,9 +13775,9 @@
       </w:tcPr>
     </w:tblStylePr>
   </w:style>
-  <w:style w:type="table" w:styleId="43">
+  <w:style w:type="table" w:styleId="777">
     <w:name w:val="Grid Table 4 - Accent 3"/>
-    <w:basedOn w:val="720"/>
+    <w:basedOn w:val="927"/>
     <w:uiPriority w:val="59"/>
     <w:pPr>
       <w:pBdr/>
@@ -14023,9 +14008,9 @@
       </w:tcPr>
     </w:tblStylePr>
   </w:style>
-  <w:style w:type="table" w:styleId="44">
+  <w:style w:type="table" w:styleId="778">
     <w:name w:val="Grid Table 4 - Accent 4"/>
-    <w:basedOn w:val="720"/>
+    <w:basedOn w:val="927"/>
     <w:uiPriority w:val="59"/>
     <w:pPr>
       <w:pBdr/>
@@ -14256,9 +14241,9 @@
       </w:tcPr>
     </w:tblStylePr>
   </w:style>
-  <w:style w:type="table" w:styleId="45">
+  <w:style w:type="table" w:styleId="779">
     <w:name w:val="Grid Table 4 - Accent 5"/>
-    <w:basedOn w:val="720"/>
+    <w:basedOn w:val="927"/>
     <w:uiPriority w:val="59"/>
     <w:pPr>
       <w:pBdr/>
@@ -14489,9 +14474,9 @@
       </w:tcPr>
     </w:tblStylePr>
   </w:style>
-  <w:style w:type="table" w:styleId="46">
+  <w:style w:type="table" w:styleId="780">
     <w:name w:val="Grid Table 4 - Accent 6"/>
-    <w:basedOn w:val="720"/>
+    <w:basedOn w:val="927"/>
     <w:uiPriority w:val="59"/>
     <w:pPr>
       <w:pBdr/>
@@ -14722,9 +14707,9 @@
       </w:tcPr>
     </w:tblStylePr>
   </w:style>
-  <w:style w:type="table" w:styleId="47">
+  <w:style w:type="table" w:styleId="781">
     <w:name w:val="Grid Table 5 Dark"/>
-    <w:basedOn w:val="720"/>
+    <w:basedOn w:val="927"/>
     <w:uiPriority w:val="99"/>
     <w:pPr>
       <w:pBdr/>
@@ -14950,9 +14935,9 @@
       </w:tcPr>
     </w:tblStylePr>
   </w:style>
-  <w:style w:type="table" w:styleId="48">
+  <w:style w:type="table" w:styleId="782">
     <w:name w:val="Grid Table 5 Dark- Accent 1"/>
-    <w:basedOn w:val="720"/>
+    <w:basedOn w:val="927"/>
     <w:uiPriority w:val="99"/>
     <w:pPr>
       <w:pBdr/>
@@ -15178,9 +15163,9 @@
       </w:tcPr>
     </w:tblStylePr>
   </w:style>
-  <w:style w:type="table" w:styleId="49">
+  <w:style w:type="table" w:styleId="783">
     <w:name w:val="Grid Table 5 Dark - Accent 2"/>
-    <w:basedOn w:val="720"/>
+    <w:basedOn w:val="927"/>
     <w:uiPriority w:val="99"/>
     <w:pPr>
       <w:pBdr/>
@@ -15406,9 +15391,9 @@
       </w:tcPr>
     </w:tblStylePr>
   </w:style>
-  <w:style w:type="table" w:styleId="50">
+  <w:style w:type="table" w:styleId="784">
     <w:name w:val="Grid Table 5 Dark - Accent 3"/>
-    <w:basedOn w:val="720"/>
+    <w:basedOn w:val="927"/>
     <w:uiPriority w:val="99"/>
     <w:pPr>
       <w:pBdr/>
@@ -15634,9 +15619,9 @@
       </w:tcPr>
     </w:tblStylePr>
   </w:style>
-  <w:style w:type="table" w:styleId="51">
+  <w:style w:type="table" w:styleId="785">
     <w:name w:val="Grid Table 5 Dark- Accent 4"/>
-    <w:basedOn w:val="720"/>
+    <w:basedOn w:val="927"/>
     <w:uiPriority w:val="99"/>
     <w:pPr>
       <w:pBdr/>
@@ -15862,9 +15847,9 @@
       </w:tcPr>
     </w:tblStylePr>
   </w:style>
-  <w:style w:type="table" w:styleId="52">
+  <w:style w:type="table" w:styleId="786">
     <w:name w:val="Grid Table 5 Dark - Accent 5"/>
-    <w:basedOn w:val="720"/>
+    <w:basedOn w:val="927"/>
     <w:uiPriority w:val="99"/>
     <w:pPr>
       <w:pBdr/>
@@ -16090,9 +16075,9 @@
       </w:tcPr>
     </w:tblStylePr>
   </w:style>
-  <w:style w:type="table" w:styleId="53">
+  <w:style w:type="table" w:styleId="787">
     <w:name w:val="Grid Table 5 Dark - Accent 6"/>
-    <w:basedOn w:val="720"/>
+    <w:basedOn w:val="927"/>
     <w:uiPriority w:val="99"/>
     <w:pPr>
       <w:pBdr/>
@@ -16318,9 +16303,9 @@
       </w:tcPr>
     </w:tblStylePr>
   </w:style>
-  <w:style w:type="table" w:styleId="54">
+  <w:style w:type="table" w:styleId="788">
     <w:name w:val="Grid Table 6 Colorful"/>
-    <w:basedOn w:val="720"/>
+    <w:basedOn w:val="927"/>
     <w:uiPriority w:val="99"/>
     <w:pPr>
       <w:pBdr/>
@@ -16548,9 +16533,9 @@
       </w:tcPr>
     </w:tblStylePr>
   </w:style>
-  <w:style w:type="table" w:styleId="55">
+  <w:style w:type="table" w:styleId="789">
     <w:name w:val="Grid Table 6 Colorful - Accent 1"/>
-    <w:basedOn w:val="720"/>
+    <w:basedOn w:val="927"/>
     <w:uiPriority w:val="99"/>
     <w:pPr>
       <w:pBdr/>
@@ -16778,9 +16763,9 @@
       </w:tcPr>
     </w:tblStylePr>
   </w:style>
-  <w:style w:type="table" w:styleId="56">
+  <w:style w:type="table" w:styleId="790">
     <w:name w:val="Grid Table 6 Colorful - Accent 2"/>
-    <w:basedOn w:val="720"/>
+    <w:basedOn w:val="927"/>
     <w:uiPriority w:val="99"/>
     <w:pPr>
       <w:pBdr/>
@@ -17008,9 +16993,9 @@
       </w:tcPr>
     </w:tblStylePr>
   </w:style>
-  <w:style w:type="table" w:styleId="57">
+  <w:style w:type="table" w:styleId="791">
     <w:name w:val="Grid Table 6 Colorful - Accent 3"/>
-    <w:basedOn w:val="720"/>
+    <w:basedOn w:val="927"/>
     <w:uiPriority w:val="99"/>
     <w:pPr>
       <w:pBdr/>
@@ -17238,9 +17223,9 @@
       </w:tcPr>
     </w:tblStylePr>
   </w:style>
-  <w:style w:type="table" w:styleId="58">
+  <w:style w:type="table" w:styleId="792">
     <w:name w:val="Grid Table 6 Colorful - Accent 4"/>
-    <w:basedOn w:val="720"/>
+    <w:basedOn w:val="927"/>
     <w:uiPriority w:val="99"/>
     <w:pPr>
       <w:pBdr/>
@@ -17468,9 +17453,9 @@
       </w:tcPr>
     </w:tblStylePr>
   </w:style>
-  <w:style w:type="table" w:styleId="59">
+  <w:style w:type="table" w:styleId="793">
     <w:name w:val="Grid Table 6 Colorful - Accent 5"/>
-    <w:basedOn w:val="720"/>
+    <w:basedOn w:val="927"/>
     <w:uiPriority w:val="99"/>
     <w:pPr>
       <w:pBdr/>
@@ -17698,9 +17683,9 @@
       </w:tcPr>
     </w:tblStylePr>
   </w:style>
-  <w:style w:type="table" w:styleId="60">
+  <w:style w:type="table" w:styleId="794">
     <w:name w:val="Grid Table 6 Colorful - Accent 6"/>
-    <w:basedOn w:val="720"/>
+    <w:basedOn w:val="927"/>
     <w:uiPriority w:val="99"/>
     <w:pPr>
       <w:pBdr/>
@@ -17928,9 +17913,9 @@
       </w:tcPr>
     </w:tblStylePr>
   </w:style>
-  <w:style w:type="table" w:styleId="61">
+  <w:style w:type="table" w:styleId="795">
     <w:name w:val="Grid Table 7 Colorful"/>
-    <w:basedOn w:val="720"/>
+    <w:basedOn w:val="927"/>
     <w:uiPriority w:val="99"/>
     <w:pPr>
       <w:pBdr/>
@@ -18032,11 +18017,11 @@
         <w:tblBorders/>
       </w:tblPr>
       <w:tcPr>
-        <w:shd w:color="ffffff"/>
+        <w:shd w:val="clear" w:color="ffffff"/>
         <w:tcBorders>
-          <w:top w:val="none"/>
-          <w:left w:val="none"/>
-          <w:bottom w:val="none"/>
+          <w:top w:val="none" w:color="000000" w:sz="4" w:space="0"/>
+          <w:left w:val="none" w:color="000000" w:sz="4" w:space="0"/>
+          <w:bottom w:val="none" w:color="000000" w:sz="4" w:space="0"/>
           <w:right w:val="single" w:color="000000" w:themeColor="text1" w:themeTint="80" w:sz="4" w:space="0"/>
         </w:tcBorders>
       </w:tcPr>
@@ -18059,10 +18044,10 @@
       <w:tcPr>
         <w:shd w:val="clear" w:color="ffffff" w:themeColor="light1" w:fill="ffffff" w:themeFill="light1"/>
         <w:tcBorders>
-          <w:top w:val="none"/>
-          <w:left w:val="none"/>
+          <w:top w:val="none" w:color="000000" w:sz="4" w:space="0"/>
+          <w:left w:val="none" w:color="000000" w:sz="4" w:space="0"/>
           <w:bottom w:val="single" w:color="000000" w:themeColor="text1" w:themeTint="80" w:sz="4" w:space="0"/>
-          <w:right w:val="none"/>
+          <w:right w:val="none" w:color="000000" w:sz="4" w:space="0"/>
         </w:tcBorders>
       </w:tcPr>
     </w:tblStylePr>
@@ -18082,12 +18067,12 @@
         <w:tblBorders/>
       </w:tblPr>
       <w:tcPr>
-        <w:shd w:color="ffffff"/>
+        <w:shd w:val="clear" w:color="ffffff"/>
         <w:tcBorders>
-          <w:top w:val="none"/>
+          <w:top w:val="none" w:color="000000" w:sz="4" w:space="0"/>
           <w:left w:val="single" w:color="000000" w:themeColor="text1" w:themeTint="80" w:sz="4" w:space="0"/>
-          <w:bottom w:val="none"/>
-          <w:right w:val="none"/>
+          <w:bottom w:val="none" w:color="000000" w:sz="4" w:space="0"/>
+          <w:right w:val="none" w:color="000000" w:sz="4" w:space="0"/>
         </w:tcBorders>
       </w:tcPr>
     </w:tblStylePr>
@@ -18110,9 +18095,9 @@
         <w:shd w:val="clear" w:color="ffffff" w:themeColor="light1" w:fill="ffffff" w:themeFill="light1"/>
         <w:tcBorders>
           <w:top w:val="single" w:color="000000" w:themeColor="text1" w:themeTint="80" w:sz="4" w:space="0"/>
-          <w:left w:val="none"/>
-          <w:bottom w:val="none"/>
-          <w:right w:val="none"/>
+          <w:left w:val="none" w:color="000000" w:sz="4" w:space="0"/>
+          <w:bottom w:val="none" w:color="000000" w:sz="4" w:space="0"/>
+          <w:right w:val="none" w:color="000000" w:sz="4" w:space="0"/>
         </w:tcBorders>
       </w:tcPr>
     </w:tblStylePr>
@@ -18182,9 +18167,9 @@
       </w:tcPr>
     </w:tblStylePr>
   </w:style>
-  <w:style w:type="table" w:styleId="62">
+  <w:style w:type="table" w:styleId="796">
     <w:name w:val="Grid Table 7 Colorful - Accent 1"/>
-    <w:basedOn w:val="720"/>
+    <w:basedOn w:val="927"/>
     <w:uiPriority w:val="99"/>
     <w:pPr>
       <w:pBdr/>
@@ -18286,11 +18271,11 @@
         <w:tblBorders/>
       </w:tblPr>
       <w:tcPr>
-        <w:shd w:color="ffffff"/>
+        <w:shd w:val="clear" w:color="ffffff"/>
         <w:tcBorders>
-          <w:top w:val="none"/>
-          <w:left w:val="none"/>
-          <w:bottom w:val="none"/>
+          <w:top w:val="none" w:color="000000" w:sz="4" w:space="0"/>
+          <w:left w:val="none" w:color="000000" w:sz="4" w:space="0"/>
+          <w:bottom w:val="none" w:color="000000" w:sz="4" w:space="0"/>
           <w:right w:val="single" w:color="000000" w:themeColor="accent1" w:themeTint="80" w:sz="4" w:space="0"/>
         </w:tcBorders>
       </w:tcPr>
@@ -18313,10 +18298,10 @@
       <w:tcPr>
         <w:shd w:val="clear" w:color="ffffff" w:themeColor="light1" w:fill="ffffff" w:themeFill="light1"/>
         <w:tcBorders>
-          <w:top w:val="none"/>
-          <w:left w:val="none"/>
+          <w:top w:val="none" w:color="000000" w:sz="4" w:space="0"/>
+          <w:left w:val="none" w:color="000000" w:sz="4" w:space="0"/>
           <w:bottom w:val="single" w:color="000000" w:themeColor="accent1" w:themeTint="80" w:sz="4" w:space="0"/>
-          <w:right w:val="none"/>
+          <w:right w:val="none" w:color="000000" w:sz="4" w:space="0"/>
         </w:tcBorders>
       </w:tcPr>
     </w:tblStylePr>
@@ -18336,12 +18321,12 @@
         <w:tblBorders/>
       </w:tblPr>
       <w:tcPr>
-        <w:shd w:color="ffffff"/>
+        <w:shd w:val="clear" w:color="ffffff"/>
         <w:tcBorders>
-          <w:top w:val="none"/>
+          <w:top w:val="none" w:color="000000" w:sz="4" w:space="0"/>
           <w:left w:val="single" w:color="000000" w:themeColor="accent1" w:themeTint="80" w:sz="4" w:space="0"/>
-          <w:bottom w:val="none"/>
-          <w:right w:val="none"/>
+          <w:bottom w:val="none" w:color="000000" w:sz="4" w:space="0"/>
+          <w:right w:val="none" w:color="000000" w:sz="4" w:space="0"/>
         </w:tcBorders>
       </w:tcPr>
     </w:tblStylePr>
@@ -18364,9 +18349,9 @@
         <w:shd w:val="clear" w:color="ffffff" w:themeColor="light1" w:fill="ffffff" w:themeFill="light1"/>
         <w:tcBorders>
           <w:top w:val="single" w:color="000000" w:themeColor="accent1" w:themeTint="80" w:sz="4" w:space="0"/>
-          <w:left w:val="none"/>
-          <w:bottom w:val="none"/>
-          <w:right w:val="none"/>
+          <w:left w:val="none" w:color="000000" w:sz="4" w:space="0"/>
+          <w:bottom w:val="none" w:color="000000" w:sz="4" w:space="0"/>
+          <w:right w:val="none" w:color="000000" w:sz="4" w:space="0"/>
         </w:tcBorders>
       </w:tcPr>
     </w:tblStylePr>
@@ -18436,9 +18421,9 @@
       </w:tcPr>
     </w:tblStylePr>
   </w:style>
-  <w:style w:type="table" w:styleId="63">
+  <w:style w:type="table" w:styleId="797">
     <w:name w:val="Grid Table 7 Colorful - Accent 2"/>
-    <w:basedOn w:val="720"/>
+    <w:basedOn w:val="927"/>
     <w:uiPriority w:val="99"/>
     <w:pPr>
       <w:pBdr/>
@@ -18540,11 +18525,11 @@
         <w:tblBorders/>
       </w:tblPr>
       <w:tcPr>
-        <w:shd w:color="ffffff"/>
+        <w:shd w:val="clear" w:color="ffffff"/>
         <w:tcBorders>
-          <w:top w:val="none"/>
-          <w:left w:val="none"/>
-          <w:bottom w:val="none"/>
+          <w:top w:val="none" w:color="000000" w:sz="4" w:space="0"/>
+          <w:left w:val="none" w:color="000000" w:sz="4" w:space="0"/>
+          <w:bottom w:val="none" w:color="000000" w:sz="4" w:space="0"/>
           <w:right w:val="single" w:color="000000" w:themeColor="accent2" w:themeTint="97" w:sz="4" w:space="0"/>
         </w:tcBorders>
       </w:tcPr>
@@ -18567,10 +18552,10 @@
       <w:tcPr>
         <w:shd w:val="clear" w:color="ffffff" w:themeColor="light1" w:fill="ffffff" w:themeFill="light1"/>
         <w:tcBorders>
-          <w:top w:val="none"/>
-          <w:left w:val="none"/>
+          <w:top w:val="none" w:color="000000" w:sz="4" w:space="0"/>
+          <w:left w:val="none" w:color="000000" w:sz="4" w:space="0"/>
           <w:bottom w:val="single" w:color="000000" w:themeColor="accent2" w:themeTint="97" w:sz="4" w:space="0"/>
-          <w:right w:val="none"/>
+          <w:right w:val="none" w:color="000000" w:sz="4" w:space="0"/>
         </w:tcBorders>
       </w:tcPr>
     </w:tblStylePr>
@@ -18590,12 +18575,12 @@
         <w:tblBorders/>
       </w:tblPr>
       <w:tcPr>
-        <w:shd w:color="ffffff"/>
+        <w:shd w:val="clear" w:color="ffffff"/>
         <w:tcBorders>
-          <w:top w:val="none"/>
+          <w:top w:val="none" w:color="000000" w:sz="4" w:space="0"/>
           <w:left w:val="single" w:color="000000" w:themeColor="accent2" w:themeTint="97" w:sz="4" w:space="0"/>
-          <w:bottom w:val="none"/>
-          <w:right w:val="none"/>
+          <w:bottom w:val="none" w:color="000000" w:sz="4" w:space="0"/>
+          <w:right w:val="none" w:color="000000" w:sz="4" w:space="0"/>
         </w:tcBorders>
       </w:tcPr>
     </w:tblStylePr>
@@ -18618,9 +18603,9 @@
         <w:shd w:val="clear" w:color="ffffff" w:themeColor="light1" w:fill="ffffff" w:themeFill="light1"/>
         <w:tcBorders>
           <w:top w:val="single" w:color="000000" w:themeColor="accent2" w:themeTint="97" w:sz="4" w:space="0"/>
-          <w:left w:val="none"/>
-          <w:bottom w:val="none"/>
-          <w:right w:val="none"/>
+          <w:left w:val="none" w:color="000000" w:sz="4" w:space="0"/>
+          <w:bottom w:val="none" w:color="000000" w:sz="4" w:space="0"/>
+          <w:right w:val="none" w:color="000000" w:sz="4" w:space="0"/>
         </w:tcBorders>
       </w:tcPr>
     </w:tblStylePr>
@@ -18690,9 +18675,9 @@
       </w:tcPr>
     </w:tblStylePr>
   </w:style>
-  <w:style w:type="table" w:styleId="64">
+  <w:style w:type="table" w:styleId="798">
     <w:name w:val="Grid Table 7 Colorful - Accent 3"/>
-    <w:basedOn w:val="720"/>
+    <w:basedOn w:val="927"/>
     <w:uiPriority w:val="99"/>
     <w:pPr>
       <w:pBdr/>
@@ -18794,11 +18779,11 @@
         <w:tblBorders/>
       </w:tblPr>
       <w:tcPr>
-        <w:shd w:color="ffffff"/>
+        <w:shd w:val="clear" w:color="ffffff"/>
         <w:tcBorders>
-          <w:top w:val="none"/>
-          <w:left w:val="none"/>
-          <w:bottom w:val="none"/>
+          <w:top w:val="none" w:color="000000" w:sz="4" w:space="0"/>
+          <w:left w:val="none" w:color="000000" w:sz="4" w:space="0"/>
+          <w:bottom w:val="none" w:color="000000" w:sz="4" w:space="0"/>
           <w:right w:val="single" w:color="000000" w:themeColor="accent3" w:themeTint="FE" w:sz="4" w:space="0"/>
         </w:tcBorders>
       </w:tcPr>
@@ -18821,10 +18806,10 @@
       <w:tcPr>
         <w:shd w:val="clear" w:color="ffffff" w:themeColor="light1" w:fill="ffffff" w:themeFill="light1"/>
         <w:tcBorders>
-          <w:top w:val="none"/>
-          <w:left w:val="none"/>
+          <w:top w:val="none" w:color="000000" w:sz="4" w:space="0"/>
+          <w:left w:val="none" w:color="000000" w:sz="4" w:space="0"/>
           <w:bottom w:val="single" w:color="000000" w:themeColor="accent3" w:themeTint="FE" w:sz="4" w:space="0"/>
-          <w:right w:val="none"/>
+          <w:right w:val="none" w:color="000000" w:sz="4" w:space="0"/>
         </w:tcBorders>
       </w:tcPr>
     </w:tblStylePr>
@@ -18844,12 +18829,12 @@
         <w:tblBorders/>
       </w:tblPr>
       <w:tcPr>
-        <w:shd w:color="ffffff"/>
+        <w:shd w:val="clear" w:color="ffffff"/>
         <w:tcBorders>
-          <w:top w:val="none"/>
+          <w:top w:val="none" w:color="000000" w:sz="4" w:space="0"/>
           <w:left w:val="single" w:color="000000" w:themeColor="accent3" w:themeTint="FE" w:sz="4" w:space="0"/>
-          <w:bottom w:val="none"/>
-          <w:right w:val="none"/>
+          <w:bottom w:val="none" w:color="000000" w:sz="4" w:space="0"/>
+          <w:right w:val="none" w:color="000000" w:sz="4" w:space="0"/>
         </w:tcBorders>
       </w:tcPr>
     </w:tblStylePr>
@@ -18872,9 +18857,9 @@
         <w:shd w:val="clear" w:color="ffffff" w:themeColor="light1" w:fill="ffffff" w:themeFill="light1"/>
         <w:tcBorders>
           <w:top w:val="single" w:color="000000" w:themeColor="accent3" w:themeTint="FE" w:sz="4" w:space="0"/>
-          <w:left w:val="none"/>
-          <w:bottom w:val="none"/>
-          <w:right w:val="none"/>
+          <w:left w:val="none" w:color="000000" w:sz="4" w:space="0"/>
+          <w:bottom w:val="none" w:color="000000" w:sz="4" w:space="0"/>
+          <w:right w:val="none" w:color="000000" w:sz="4" w:space="0"/>
         </w:tcBorders>
       </w:tcPr>
     </w:tblStylePr>
@@ -18944,9 +18929,9 @@
       </w:tcPr>
     </w:tblStylePr>
   </w:style>
-  <w:style w:type="table" w:styleId="65">
+  <w:style w:type="table" w:styleId="799">
     <w:name w:val="Grid Table 7 Colorful - Accent 4"/>
-    <w:basedOn w:val="720"/>
+    <w:basedOn w:val="927"/>
     <w:uiPriority w:val="99"/>
     <w:pPr>
       <w:pBdr/>
@@ -19048,11 +19033,11 @@
         <w:tblBorders/>
       </w:tblPr>
       <w:tcPr>
-        <w:shd w:color="ffffff"/>
+        <w:shd w:val="clear" w:color="ffffff"/>
         <w:tcBorders>
-          <w:top w:val="none"/>
-          <w:left w:val="none"/>
-          <w:bottom w:val="none"/>
+          <w:top w:val="none" w:color="000000" w:sz="4" w:space="0"/>
+          <w:left w:val="none" w:color="000000" w:sz="4" w:space="0"/>
+          <w:bottom w:val="none" w:color="000000" w:sz="4" w:space="0"/>
           <w:right w:val="single" w:color="000000" w:themeColor="accent4" w:themeTint="9A" w:sz="4" w:space="0"/>
         </w:tcBorders>
       </w:tcPr>
@@ -19075,10 +19060,10 @@
       <w:tcPr>
         <w:shd w:val="clear" w:color="ffffff" w:themeColor="light1" w:fill="ffffff" w:themeFill="light1"/>
         <w:tcBorders>
-          <w:top w:val="none"/>
-          <w:left w:val="none"/>
+          <w:top w:val="none" w:color="000000" w:sz="4" w:space="0"/>
+          <w:left w:val="none" w:color="000000" w:sz="4" w:space="0"/>
           <w:bottom w:val="single" w:color="000000" w:themeColor="accent4" w:themeTint="9A" w:sz="4" w:space="0"/>
-          <w:right w:val="none"/>
+          <w:right w:val="none" w:color="000000" w:sz="4" w:space="0"/>
         </w:tcBorders>
       </w:tcPr>
     </w:tblStylePr>
@@ -19098,12 +19083,12 @@
         <w:tblBorders/>
       </w:tblPr>
       <w:tcPr>
-        <w:shd w:color="ffffff"/>
+        <w:shd w:val="clear" w:color="ffffff"/>
         <w:tcBorders>
-          <w:top w:val="none"/>
+          <w:top w:val="none" w:color="000000" w:sz="4" w:space="0"/>
           <w:left w:val="single" w:color="000000" w:themeColor="accent4" w:themeTint="9A" w:sz="4" w:space="0"/>
-          <w:bottom w:val="none"/>
-          <w:right w:val="none"/>
+          <w:bottom w:val="none" w:color="000000" w:sz="4" w:space="0"/>
+          <w:right w:val="none" w:color="000000" w:sz="4" w:space="0"/>
         </w:tcBorders>
       </w:tcPr>
     </w:tblStylePr>
@@ -19126,9 +19111,9 @@
         <w:shd w:val="clear" w:color="ffffff" w:themeColor="light1" w:fill="ffffff" w:themeFill="light1"/>
         <w:tcBorders>
           <w:top w:val="single" w:color="000000" w:themeColor="accent4" w:themeTint="9A" w:sz="4" w:space="0"/>
-          <w:left w:val="none"/>
-          <w:bottom w:val="none"/>
-          <w:right w:val="none"/>
+          <w:left w:val="none" w:color="000000" w:sz="4" w:space="0"/>
+          <w:bottom w:val="none" w:color="000000" w:sz="4" w:space="0"/>
+          <w:right w:val="none" w:color="000000" w:sz="4" w:space="0"/>
         </w:tcBorders>
       </w:tcPr>
     </w:tblStylePr>
@@ -19198,9 +19183,9 @@
       </w:tcPr>
     </w:tblStylePr>
   </w:style>
-  <w:style w:type="table" w:styleId="66">
+  <w:style w:type="table" w:styleId="800">
     <w:name w:val="Grid Table 7 Colorful - Accent 5"/>
-    <w:basedOn w:val="720"/>
+    <w:basedOn w:val="927"/>
     <w:uiPriority w:val="99"/>
     <w:pPr>
       <w:pBdr/>
@@ -19302,11 +19287,11 @@
         <w:tblBorders/>
       </w:tblPr>
       <w:tcPr>
-        <w:shd w:color="ffffff"/>
+        <w:shd w:val="clear" w:color="ffffff"/>
         <w:tcBorders>
-          <w:top w:val="none"/>
-          <w:left w:val="none"/>
-          <w:bottom w:val="none"/>
+          <w:top w:val="none" w:color="000000" w:sz="4" w:space="0"/>
+          <w:left w:val="none" w:color="000000" w:sz="4" w:space="0"/>
+          <w:bottom w:val="none" w:color="000000" w:sz="4" w:space="0"/>
           <w:right w:val="single" w:color="000000" w:themeColor="accent5" w:themeTint="90" w:sz="4" w:space="0"/>
         </w:tcBorders>
       </w:tcPr>
@@ -19329,10 +19314,10 @@
       <w:tcPr>
         <w:shd w:val="clear" w:color="ffffff" w:themeColor="light1" w:fill="ffffff" w:themeFill="light1"/>
         <w:tcBorders>
-          <w:top w:val="none"/>
-          <w:left w:val="none"/>
+          <w:top w:val="none" w:color="000000" w:sz="4" w:space="0"/>
+          <w:left w:val="none" w:color="000000" w:sz="4" w:space="0"/>
           <w:bottom w:val="single" w:color="000000" w:themeColor="accent5" w:themeTint="90" w:sz="4" w:space="0"/>
-          <w:right w:val="none"/>
+          <w:right w:val="none" w:color="000000" w:sz="4" w:space="0"/>
         </w:tcBorders>
       </w:tcPr>
     </w:tblStylePr>
@@ -19352,12 +19337,12 @@
         <w:tblBorders/>
       </w:tblPr>
       <w:tcPr>
-        <w:shd w:color="ffffff"/>
+        <w:shd w:val="clear" w:color="ffffff"/>
         <w:tcBorders>
-          <w:top w:val="none"/>
+          <w:top w:val="none" w:color="000000" w:sz="4" w:space="0"/>
           <w:left w:val="single" w:color="000000" w:themeColor="accent5" w:themeTint="90" w:sz="4" w:space="0"/>
-          <w:bottom w:val="none"/>
-          <w:right w:val="none"/>
+          <w:bottom w:val="none" w:color="000000" w:sz="4" w:space="0"/>
+          <w:right w:val="none" w:color="000000" w:sz="4" w:space="0"/>
         </w:tcBorders>
       </w:tcPr>
     </w:tblStylePr>
@@ -19380,9 +19365,9 @@
         <w:shd w:val="clear" w:color="ffffff" w:themeColor="light1" w:fill="ffffff" w:themeFill="light1"/>
         <w:tcBorders>
           <w:top w:val="single" w:color="000000" w:themeColor="accent5" w:themeTint="90" w:sz="4" w:space="0"/>
-          <w:left w:val="none"/>
-          <w:bottom w:val="none"/>
-          <w:right w:val="none"/>
+          <w:left w:val="none" w:color="000000" w:sz="4" w:space="0"/>
+          <w:bottom w:val="none" w:color="000000" w:sz="4" w:space="0"/>
+          <w:right w:val="none" w:color="000000" w:sz="4" w:space="0"/>
         </w:tcBorders>
       </w:tcPr>
     </w:tblStylePr>
@@ -19452,9 +19437,9 @@
       </w:tcPr>
     </w:tblStylePr>
   </w:style>
-  <w:style w:type="table" w:styleId="67">
+  <w:style w:type="table" w:styleId="801">
     <w:name w:val="Grid Table 7 Colorful - Accent 6"/>
-    <w:basedOn w:val="720"/>
+    <w:basedOn w:val="927"/>
     <w:uiPriority w:val="99"/>
     <w:pPr>
       <w:pBdr/>
@@ -19556,11 +19541,11 @@
         <w:tblBorders/>
       </w:tblPr>
       <w:tcPr>
-        <w:shd w:color="ffffff"/>
+        <w:shd w:val="clear" w:color="ffffff"/>
         <w:tcBorders>
-          <w:top w:val="none"/>
-          <w:left w:val="none"/>
-          <w:bottom w:val="none"/>
+          <w:top w:val="none" w:color="000000" w:sz="4" w:space="0"/>
+          <w:left w:val="none" w:color="000000" w:sz="4" w:space="0"/>
+          <w:bottom w:val="none" w:color="000000" w:sz="4" w:space="0"/>
           <w:right w:val="single" w:color="000000" w:themeColor="accent6" w:themeTint="90" w:sz="4" w:space="0"/>
         </w:tcBorders>
       </w:tcPr>
@@ -19583,10 +19568,10 @@
       <w:tcPr>
         <w:shd w:val="clear" w:color="ffffff" w:themeColor="light1" w:fill="ffffff" w:themeFill="light1"/>
         <w:tcBorders>
-          <w:top w:val="none"/>
-          <w:left w:val="none"/>
+          <w:top w:val="none" w:color="000000" w:sz="4" w:space="0"/>
+          <w:left w:val="none" w:color="000000" w:sz="4" w:space="0"/>
           <w:bottom w:val="single" w:color="000000" w:themeColor="accent6" w:themeTint="90" w:sz="4" w:space="0"/>
-          <w:right w:val="none"/>
+          <w:right w:val="none" w:color="000000" w:sz="4" w:space="0"/>
         </w:tcBorders>
       </w:tcPr>
     </w:tblStylePr>
@@ -19606,12 +19591,12 @@
         <w:tblBorders/>
       </w:tblPr>
       <w:tcPr>
-        <w:shd w:color="ffffff"/>
+        <w:shd w:val="clear" w:color="ffffff"/>
         <w:tcBorders>
-          <w:top w:val="none"/>
+          <w:top w:val="none" w:color="000000" w:sz="4" w:space="0"/>
           <w:left w:val="single" w:color="000000" w:themeColor="accent6" w:themeTint="90" w:sz="4" w:space="0"/>
-          <w:bottom w:val="none"/>
-          <w:right w:val="none"/>
+          <w:bottom w:val="none" w:color="000000" w:sz="4" w:space="0"/>
+          <w:right w:val="none" w:color="000000" w:sz="4" w:space="0"/>
         </w:tcBorders>
       </w:tcPr>
     </w:tblStylePr>
@@ -19634,9 +19619,9 @@
         <w:shd w:val="clear" w:color="ffffff" w:themeColor="light1" w:fill="ffffff" w:themeFill="light1"/>
         <w:tcBorders>
           <w:top w:val="single" w:color="000000" w:themeColor="accent6" w:themeTint="90" w:sz="4" w:space="0"/>
-          <w:left w:val="none"/>
-          <w:bottom w:val="none"/>
-          <w:right w:val="none"/>
+          <w:left w:val="none" w:color="000000" w:sz="4" w:space="0"/>
+          <w:bottom w:val="none" w:color="000000" w:sz="4" w:space="0"/>
+          <w:right w:val="none" w:color="000000" w:sz="4" w:space="0"/>
         </w:tcBorders>
       </w:tcPr>
     </w:tblStylePr>
@@ -19706,9 +19691,9 @@
       </w:tcPr>
     </w:tblStylePr>
   </w:style>
-  <w:style w:type="table" w:styleId="68">
+  <w:style w:type="table" w:styleId="802">
     <w:name w:val="List Table 1 Light"/>
-    <w:basedOn w:val="720"/>
+    <w:basedOn w:val="927"/>
     <w:uiPriority w:val="99"/>
     <w:pPr>
       <w:pBdr/>
@@ -19922,9 +19907,9 @@
       </w:tcPr>
     </w:tblStylePr>
   </w:style>
-  <w:style w:type="table" w:styleId="69">
+  <w:style w:type="table" w:styleId="803">
     <w:name w:val="List Table 1 Light - Accent 1"/>
-    <w:basedOn w:val="720"/>
+    <w:basedOn w:val="927"/>
     <w:uiPriority w:val="99"/>
     <w:pPr>
       <w:pBdr/>
@@ -20138,9 +20123,9 @@
       </w:tcPr>
     </w:tblStylePr>
   </w:style>
-  <w:style w:type="table" w:styleId="70">
+  <w:style w:type="table" w:styleId="804">
     <w:name w:val="List Table 1 Light - Accent 2"/>
-    <w:basedOn w:val="720"/>
+    <w:basedOn w:val="927"/>
     <w:uiPriority w:val="99"/>
     <w:pPr>
       <w:pBdr/>
@@ -20354,9 +20339,9 @@
       </w:tcPr>
     </w:tblStylePr>
   </w:style>
-  <w:style w:type="table" w:styleId="71">
+  <w:style w:type="table" w:styleId="805">
     <w:name w:val="List Table 1 Light - Accent 3"/>
-    <w:basedOn w:val="720"/>
+    <w:basedOn w:val="927"/>
     <w:uiPriority w:val="99"/>
     <w:pPr>
       <w:pBdr/>
@@ -20570,9 +20555,9 @@
       </w:tcPr>
     </w:tblStylePr>
   </w:style>
-  <w:style w:type="table" w:styleId="72">
+  <w:style w:type="table" w:styleId="806">
     <w:name w:val="List Table 1 Light - Accent 4"/>
-    <w:basedOn w:val="720"/>
+    <w:basedOn w:val="927"/>
     <w:uiPriority w:val="99"/>
     <w:pPr>
       <w:pBdr/>
@@ -20786,9 +20771,9 @@
       </w:tcPr>
     </w:tblStylePr>
   </w:style>
-  <w:style w:type="table" w:styleId="73">
+  <w:style w:type="table" w:styleId="807">
     <w:name w:val="List Table 1 Light - Accent 5"/>
-    <w:basedOn w:val="720"/>
+    <w:basedOn w:val="927"/>
     <w:uiPriority w:val="99"/>
     <w:pPr>
       <w:pBdr/>
@@ -21002,9 +20987,9 @@
       </w:tcPr>
     </w:tblStylePr>
   </w:style>
-  <w:style w:type="table" w:styleId="74">
+  <w:style w:type="table" w:styleId="808">
     <w:name w:val="List Table 1 Light - Accent 6"/>
-    <w:basedOn w:val="720"/>
+    <w:basedOn w:val="927"/>
     <w:uiPriority w:val="99"/>
     <w:pPr>
       <w:pBdr/>
@@ -21218,9 +21203,9 @@
       </w:tcPr>
     </w:tblStylePr>
   </w:style>
-  <w:style w:type="table" w:styleId="75">
+  <w:style w:type="table" w:styleId="809">
     <w:name w:val="List Table 2"/>
-    <w:basedOn w:val="720"/>
+    <w:basedOn w:val="927"/>
     <w:uiPriority w:val="99"/>
     <w:pPr>
       <w:pBdr/>
@@ -21456,9 +21441,9 @@
       </w:tcPr>
     </w:tblStylePr>
   </w:style>
-  <w:style w:type="table" w:styleId="76">
+  <w:style w:type="table" w:styleId="810">
     <w:name w:val="List Table 2 - Accent 1"/>
-    <w:basedOn w:val="720"/>
+    <w:basedOn w:val="927"/>
     <w:uiPriority w:val="99"/>
     <w:pPr>
       <w:pBdr/>
@@ -21694,9 +21679,9 @@
       </w:tcPr>
     </w:tblStylePr>
   </w:style>
-  <w:style w:type="table" w:styleId="77">
+  <w:style w:type="table" w:styleId="811">
     <w:name w:val="List Table 2 - Accent 2"/>
-    <w:basedOn w:val="720"/>
+    <w:basedOn w:val="927"/>
     <w:uiPriority w:val="99"/>
     <w:pPr>
       <w:pBdr/>
@@ -21932,9 +21917,9 @@
       </w:tcPr>
     </w:tblStylePr>
   </w:style>
-  <w:style w:type="table" w:styleId="78">
+  <w:style w:type="table" w:styleId="812">
     <w:name w:val="List Table 2 - Accent 3"/>
-    <w:basedOn w:val="720"/>
+    <w:basedOn w:val="927"/>
     <w:uiPriority w:val="99"/>
     <w:pPr>
       <w:pBdr/>
@@ -22170,9 +22155,9 @@
       </w:tcPr>
     </w:tblStylePr>
   </w:style>
-  <w:style w:type="table" w:styleId="79">
+  <w:style w:type="table" w:styleId="813">
     <w:name w:val="List Table 2 - Accent 4"/>
-    <w:basedOn w:val="720"/>
+    <w:basedOn w:val="927"/>
     <w:uiPriority w:val="99"/>
     <w:pPr>
       <w:pBdr/>
@@ -22408,9 +22393,9 @@
       </w:tcPr>
     </w:tblStylePr>
   </w:style>
-  <w:style w:type="table" w:styleId="80">
+  <w:style w:type="table" w:styleId="814">
     <w:name w:val="List Table 2 - Accent 5"/>
-    <w:basedOn w:val="720"/>
+    <w:basedOn w:val="927"/>
     <w:uiPriority w:val="99"/>
     <w:pPr>
       <w:pBdr/>
@@ -22646,9 +22631,9 @@
       </w:tcPr>
     </w:tblStylePr>
   </w:style>
-  <w:style w:type="table" w:styleId="81">
+  <w:style w:type="table" w:styleId="815">
     <w:name w:val="List Table 2 - Accent 6"/>
-    <w:basedOn w:val="720"/>
+    <w:basedOn w:val="927"/>
     <w:uiPriority w:val="99"/>
     <w:pPr>
       <w:pBdr/>
@@ -22884,9 +22869,9 @@
       </w:tcPr>
     </w:tblStylePr>
   </w:style>
-  <w:style w:type="table" w:styleId="82">
+  <w:style w:type="table" w:styleId="816">
     <w:name w:val="List Table 3"/>
-    <w:basedOn w:val="720"/>
+    <w:basedOn w:val="927"/>
     <w:uiPriority w:val="99"/>
     <w:pPr>
       <w:pBdr/>
@@ -23112,9 +23097,9 @@
       </w:tcPr>
     </w:tblStylePr>
   </w:style>
-  <w:style w:type="table" w:styleId="83">
+  <w:style w:type="table" w:styleId="817">
     <w:name w:val="List Table 3 - Accent 1"/>
-    <w:basedOn w:val="720"/>
+    <w:basedOn w:val="927"/>
     <w:uiPriority w:val="99"/>
     <w:pPr>
       <w:pBdr/>
@@ -23340,9 +23325,9 @@
       </w:tcPr>
     </w:tblStylePr>
   </w:style>
-  <w:style w:type="table" w:styleId="84">
+  <w:style w:type="table" w:styleId="818">
     <w:name w:val="List Table 3 - Accent 2"/>
-    <w:basedOn w:val="720"/>
+    <w:basedOn w:val="927"/>
     <w:uiPriority w:val="99"/>
     <w:pPr>
       <w:pBdr/>
@@ -23568,9 +23553,9 @@
       </w:tcPr>
     </w:tblStylePr>
   </w:style>
-  <w:style w:type="table" w:styleId="85">
+  <w:style w:type="table" w:styleId="819">
     <w:name w:val="List Table 3 - Accent 3"/>
-    <w:basedOn w:val="720"/>
+    <w:basedOn w:val="927"/>
     <w:uiPriority w:val="99"/>
     <w:pPr>
       <w:pBdr/>
@@ -23796,9 +23781,9 @@
       </w:tcPr>
     </w:tblStylePr>
   </w:style>
-  <w:style w:type="table" w:styleId="86">
+  <w:style w:type="table" w:styleId="820">
     <w:name w:val="List Table 3 - Accent 4"/>
-    <w:basedOn w:val="720"/>
+    <w:basedOn w:val="927"/>
     <w:uiPriority w:val="99"/>
     <w:pPr>
       <w:pBdr/>
@@ -24024,9 +24009,9 @@
       </w:tcPr>
     </w:tblStylePr>
   </w:style>
-  <w:style w:type="table" w:styleId="87">
+  <w:style w:type="table" w:styleId="821">
     <w:name w:val="List Table 3 - Accent 5"/>
-    <w:basedOn w:val="720"/>
+    <w:basedOn w:val="927"/>
     <w:uiPriority w:val="99"/>
     <w:pPr>
       <w:pBdr/>
@@ -24252,9 +24237,9 @@
       </w:tcPr>
     </w:tblStylePr>
   </w:style>
-  <w:style w:type="table" w:styleId="88">
+  <w:style w:type="table" w:styleId="822">
     <w:name w:val="List Table 3 - Accent 6"/>
-    <w:basedOn w:val="720"/>
+    <w:basedOn w:val="927"/>
     <w:uiPriority w:val="99"/>
     <w:pPr>
       <w:pBdr/>
@@ -24480,9 +24465,9 @@
       </w:tcPr>
     </w:tblStylePr>
   </w:style>
-  <w:style w:type="table" w:styleId="89">
+  <w:style w:type="table" w:styleId="823">
     <w:name w:val="List Table 4"/>
-    <w:basedOn w:val="720"/>
+    <w:basedOn w:val="927"/>
     <w:uiPriority w:val="99"/>
     <w:pPr>
       <w:pBdr/>
@@ -24705,9 +24690,9 @@
       </w:tcPr>
     </w:tblStylePr>
   </w:style>
-  <w:style w:type="table" w:styleId="90">
+  <w:style w:type="table" w:styleId="824">
     <w:name w:val="List Table 4 - Accent 1"/>
-    <w:basedOn w:val="720"/>
+    <w:basedOn w:val="927"/>
     <w:uiPriority w:val="99"/>
     <w:pPr>
       <w:pBdr/>
@@ -24930,9 +24915,9 @@
       </w:tcPr>
     </w:tblStylePr>
   </w:style>
-  <w:style w:type="table" w:styleId="91">
+  <w:style w:type="table" w:styleId="825">
     <w:name w:val="List Table 4 - Accent 2"/>
-    <w:basedOn w:val="720"/>
+    <w:basedOn w:val="927"/>
     <w:uiPriority w:val="99"/>
     <w:pPr>
       <w:pBdr/>
@@ -25155,9 +25140,9 @@
       </w:tcPr>
     </w:tblStylePr>
   </w:style>
-  <w:style w:type="table" w:styleId="92">
+  <w:style w:type="table" w:styleId="826">
     <w:name w:val="List Table 4 - Accent 3"/>
-    <w:basedOn w:val="720"/>
+    <w:basedOn w:val="927"/>
     <w:uiPriority w:val="99"/>
     <w:pPr>
       <w:pBdr/>
@@ -25380,9 +25365,9 @@
       </w:tcPr>
     </w:tblStylePr>
   </w:style>
-  <w:style w:type="table" w:styleId="93">
+  <w:style w:type="table" w:styleId="827">
     <w:name w:val="List Table 4 - Accent 4"/>
-    <w:basedOn w:val="720"/>
+    <w:basedOn w:val="927"/>
     <w:uiPriority w:val="99"/>
     <w:pPr>
       <w:pBdr/>
@@ -25605,9 +25590,9 @@
       </w:tcPr>
     </w:tblStylePr>
   </w:style>
-  <w:style w:type="table" w:styleId="94">
+  <w:style w:type="table" w:styleId="828">
     <w:name w:val="List Table 4 - Accent 5"/>
-    <w:basedOn w:val="720"/>
+    <w:basedOn w:val="927"/>
     <w:uiPriority w:val="99"/>
     <w:pPr>
       <w:pBdr/>
@@ -25830,9 +25815,9 @@
       </w:tcPr>
     </w:tblStylePr>
   </w:style>
-  <w:style w:type="table" w:styleId="95">
+  <w:style w:type="table" w:styleId="829">
     <w:name w:val="List Table 4 - Accent 6"/>
-    <w:basedOn w:val="720"/>
+    <w:basedOn w:val="927"/>
     <w:uiPriority w:val="99"/>
     <w:pPr>
       <w:pBdr/>
@@ -26055,9 +26040,9 @@
       </w:tcPr>
     </w:tblStylePr>
   </w:style>
-  <w:style w:type="table" w:styleId="96">
+  <w:style w:type="table" w:styleId="830">
     <w:name w:val="List Table 5 Dark"/>
-    <w:basedOn w:val="720"/>
+    <w:basedOn w:val="927"/>
     <w:uiPriority w:val="99"/>
     <w:pPr>
       <w:pBdr/>
@@ -26297,9 +26282,9 @@
       </w:tcPr>
     </w:tblStylePr>
   </w:style>
-  <w:style w:type="table" w:styleId="97">
+  <w:style w:type="table" w:styleId="831">
     <w:name w:val="List Table 5 Dark - Accent 1"/>
-    <w:basedOn w:val="720"/>
+    <w:basedOn w:val="927"/>
     <w:uiPriority w:val="99"/>
     <w:pPr>
       <w:pBdr/>
@@ -26539,9 +26524,9 @@
       </w:tcPr>
     </w:tblStylePr>
   </w:style>
-  <w:style w:type="table" w:styleId="98">
+  <w:style w:type="table" w:styleId="832">
     <w:name w:val="List Table 5 Dark - Accent 2"/>
-    <w:basedOn w:val="720"/>
+    <w:basedOn w:val="927"/>
     <w:uiPriority w:val="99"/>
     <w:pPr>
       <w:pBdr/>
@@ -26781,9 +26766,9 @@
       </w:tcPr>
     </w:tblStylePr>
   </w:style>
-  <w:style w:type="table" w:styleId="99">
+  <w:style w:type="table" w:styleId="833">
     <w:name w:val="List Table 5 Dark - Accent 3"/>
-    <w:basedOn w:val="720"/>
+    <w:basedOn w:val="927"/>
     <w:uiPriority w:val="99"/>
     <w:pPr>
       <w:pBdr/>
@@ -27023,9 +27008,9 @@
       </w:tcPr>
     </w:tblStylePr>
   </w:style>
-  <w:style w:type="table" w:styleId="100">
+  <w:style w:type="table" w:styleId="834">
     <w:name w:val="List Table 5 Dark - Accent 4"/>
-    <w:basedOn w:val="720"/>
+    <w:basedOn w:val="927"/>
     <w:uiPriority w:val="99"/>
     <w:pPr>
       <w:pBdr/>
@@ -27265,9 +27250,9 @@
       </w:tcPr>
     </w:tblStylePr>
   </w:style>
-  <w:style w:type="table" w:styleId="101">
+  <w:style w:type="table" w:styleId="835">
     <w:name w:val="List Table 5 Dark - Accent 5"/>
-    <w:basedOn w:val="720"/>
+    <w:basedOn w:val="927"/>
     <w:uiPriority w:val="99"/>
     <w:pPr>
       <w:pBdr/>
@@ -27507,9 +27492,9 @@
       </w:tcPr>
     </w:tblStylePr>
   </w:style>
-  <w:style w:type="table" w:styleId="102">
+  <w:style w:type="table" w:styleId="836">
     <w:name w:val="List Table 5 Dark - Accent 6"/>
-    <w:basedOn w:val="720"/>
+    <w:basedOn w:val="927"/>
     <w:uiPriority w:val="99"/>
     <w:pPr>
       <w:pBdr/>
@@ -27749,9 +27734,9 @@
       </w:tcPr>
     </w:tblStylePr>
   </w:style>
-  <w:style w:type="table" w:styleId="103">
+  <w:style w:type="table" w:styleId="837">
     <w:name w:val="List Table 6 Colorful"/>
-    <w:basedOn w:val="720"/>
+    <w:basedOn w:val="927"/>
     <w:uiPriority w:val="99"/>
     <w:pPr>
       <w:pBdr/>
@@ -27972,9 +27957,9 @@
       </w:tcPr>
     </w:tblStylePr>
   </w:style>
-  <w:style w:type="table" w:styleId="104">
+  <w:style w:type="table" w:styleId="838">
     <w:name w:val="List Table 6 Colorful - Accent 1"/>
-    <w:basedOn w:val="720"/>
+    <w:basedOn w:val="927"/>
     <w:uiPriority w:val="99"/>
     <w:pPr>
       <w:pBdr/>
@@ -28195,9 +28180,9 @@
       </w:tcPr>
     </w:tblStylePr>
   </w:style>
-  <w:style w:type="table" w:styleId="105">
+  <w:style w:type="table" w:styleId="839">
     <w:name w:val="List Table 6 Colorful - Accent 2"/>
-    <w:basedOn w:val="720"/>
+    <w:basedOn w:val="927"/>
     <w:uiPriority w:val="99"/>
     <w:pPr>
       <w:pBdr/>
@@ -28418,9 +28403,9 @@
       </w:tcPr>
     </w:tblStylePr>
   </w:style>
-  <w:style w:type="table" w:styleId="106">
+  <w:style w:type="table" w:styleId="840">
     <w:name w:val="List Table 6 Colorful - Accent 3"/>
-    <w:basedOn w:val="720"/>
+    <w:basedOn w:val="927"/>
     <w:uiPriority w:val="99"/>
     <w:pPr>
       <w:pBdr/>
@@ -28641,9 +28626,9 @@
       </w:tcPr>
     </w:tblStylePr>
   </w:style>
-  <w:style w:type="table" w:styleId="107">
+  <w:style w:type="table" w:styleId="841">
     <w:name w:val="List Table 6 Colorful - Accent 4"/>
-    <w:basedOn w:val="720"/>
+    <w:basedOn w:val="927"/>
     <w:uiPriority w:val="99"/>
     <w:pPr>
       <w:pBdr/>
@@ -28864,9 +28849,9 @@
       </w:tcPr>
     </w:tblStylePr>
   </w:style>
-  <w:style w:type="table" w:styleId="108">
+  <w:style w:type="table" w:styleId="842">
     <w:name w:val="List Table 6 Colorful - Accent 5"/>
-    <w:basedOn w:val="720"/>
+    <w:basedOn w:val="927"/>
     <w:uiPriority w:val="99"/>
     <w:pPr>
       <w:pBdr/>
@@ -29087,9 +29072,9 @@
       </w:tcPr>
     </w:tblStylePr>
   </w:style>
-  <w:style w:type="table" w:styleId="109">
+  <w:style w:type="table" w:styleId="843">
     <w:name w:val="List Table 6 Colorful - Accent 6"/>
-    <w:basedOn w:val="720"/>
+    <w:basedOn w:val="927"/>
     <w:uiPriority w:val="99"/>
     <w:pPr>
       <w:pBdr/>
@@ -29310,9 +29295,9 @@
       </w:tcPr>
     </w:tblStylePr>
   </w:style>
-  <w:style w:type="table" w:styleId="110">
+  <w:style w:type="table" w:styleId="844">
     <w:name w:val="List Table 7 Colorful"/>
-    <w:basedOn w:val="720"/>
+    <w:basedOn w:val="927"/>
     <w:uiPriority w:val="99"/>
     <w:pPr>
       <w:pBdr/>
@@ -29411,11 +29396,11 @@
         <w:tblBorders/>
       </w:tblPr>
       <w:tcPr>
-        <w:shd w:color="ffffff"/>
+        <w:shd w:val="clear" w:color="ffffff"/>
         <w:tcBorders>
-          <w:top w:val="none"/>
-          <w:left w:val="none"/>
-          <w:bottom w:val="none"/>
+          <w:top w:val="none" w:color="000000" w:sz="4" w:space="0"/>
+          <w:left w:val="none" w:color="000000" w:sz="4" w:space="0"/>
+          <w:bottom w:val="none" w:color="000000" w:sz="4" w:space="0"/>
           <w:right w:val="single" w:color="000000" w:themeColor="text1" w:themeTint="80" w:sz="4" w:space="0"/>
         </w:tcBorders>
       </w:tcPr>
@@ -29438,10 +29423,10 @@
       <w:tcPr>
         <w:shd w:val="clear" w:color="ffffff" w:themeColor="light1" w:fill="ffffff" w:themeFill="light1"/>
         <w:tcBorders>
-          <w:top w:val="none"/>
-          <w:left w:val="none"/>
+          <w:top w:val="none" w:color="000000" w:sz="4" w:space="0"/>
+          <w:left w:val="none" w:color="000000" w:sz="4" w:space="0"/>
           <w:bottom w:val="single" w:color="000000" w:themeColor="text1" w:themeTint="80" w:sz="4" w:space="0"/>
-          <w:right w:val="none"/>
+          <w:right w:val="none" w:color="000000" w:sz="4" w:space="0"/>
         </w:tcBorders>
       </w:tcPr>
     </w:tblStylePr>
@@ -29461,12 +29446,12 @@
         <w:tblBorders/>
       </w:tblPr>
       <w:tcPr>
-        <w:shd w:color="ffffff"/>
+        <w:shd w:val="clear" w:color="ffffff"/>
         <w:tcBorders>
-          <w:top w:val="none"/>
+          <w:top w:val="none" w:color="000000" w:sz="4" w:space="0"/>
           <w:left w:val="single" w:color="000000" w:themeColor="text1" w:themeTint="80" w:sz="4" w:space="0"/>
-          <w:bottom w:val="none"/>
-          <w:right w:val="none"/>
+          <w:bottom w:val="none" w:color="000000" w:sz="4" w:space="0"/>
+          <w:right w:val="none" w:color="000000" w:sz="4" w:space="0"/>
         </w:tcBorders>
       </w:tcPr>
     </w:tblStylePr>
@@ -29489,9 +29474,9 @@
         <w:shd w:val="clear" w:color="ffffff" w:themeColor="light1" w:fill="ffffff" w:themeFill="light1"/>
         <w:tcBorders>
           <w:top w:val="single" w:color="000000" w:themeColor="text1" w:themeTint="80" w:sz="4" w:space="0"/>
-          <w:left w:val="none"/>
-          <w:bottom w:val="none"/>
-          <w:right w:val="none"/>
+          <w:left w:val="none" w:color="000000" w:sz="4" w:space="0"/>
+          <w:bottom w:val="none" w:color="000000" w:sz="4" w:space="0"/>
+          <w:right w:val="none" w:color="000000" w:sz="4" w:space="0"/>
         </w:tcBorders>
       </w:tcPr>
     </w:tblStylePr>
@@ -29566,9 +29551,9 @@
       </w:tcPr>
     </w:tblStylePr>
   </w:style>
-  <w:style w:type="table" w:styleId="111">
+  <w:style w:type="table" w:styleId="845">
     <w:name w:val="List Table 7 Colorful - Accent 1"/>
-    <w:basedOn w:val="720"/>
+    <w:basedOn w:val="927"/>
     <w:uiPriority w:val="99"/>
     <w:pPr>
       <w:pBdr/>
@@ -29667,11 +29652,11 @@
         <w:tblBorders/>
       </w:tblPr>
       <w:tcPr>
-        <w:shd w:color="ffffff"/>
+        <w:shd w:val="clear" w:color="ffffff"/>
         <w:tcBorders>
-          <w:top w:val="none"/>
-          <w:left w:val="none"/>
-          <w:bottom w:val="none"/>
+          <w:top w:val="none" w:color="000000" w:sz="4" w:space="0"/>
+          <w:left w:val="none" w:color="000000" w:sz="4" w:space="0"/>
+          <w:bottom w:val="none" w:color="000000" w:sz="4" w:space="0"/>
           <w:right w:val="single" w:color="000000" w:themeColor="accent1" w:sz="4" w:space="0"/>
         </w:tcBorders>
       </w:tcPr>
@@ -29694,10 +29679,10 @@
       <w:tcPr>
         <w:shd w:val="clear" w:color="ffffff" w:themeColor="light1" w:fill="ffffff" w:themeFill="light1"/>
         <w:tcBorders>
-          <w:top w:val="none"/>
-          <w:left w:val="none"/>
+          <w:top w:val="none" w:color="000000" w:sz="4" w:space="0"/>
+          <w:left w:val="none" w:color="000000" w:sz="4" w:space="0"/>
           <w:bottom w:val="single" w:color="000000" w:themeColor="accent1" w:sz="4" w:space="0"/>
-          <w:right w:val="none"/>
+          <w:right w:val="none" w:color="000000" w:sz="4" w:space="0"/>
         </w:tcBorders>
       </w:tcPr>
     </w:tblStylePr>
@@ -29717,12 +29702,12 @@
         <w:tblBorders/>
       </w:tblPr>
       <w:tcPr>
-        <w:shd w:color="ffffff"/>
+        <w:shd w:val="clear" w:color="ffffff"/>
         <w:tcBorders>
-          <w:top w:val="none"/>
+          <w:top w:val="none" w:color="000000" w:sz="4" w:space="0"/>
           <w:left w:val="single" w:color="000000" w:themeColor="accent1" w:sz="4" w:space="0"/>
-          <w:bottom w:val="none"/>
-          <w:right w:val="none"/>
+          <w:bottom w:val="none" w:color="000000" w:sz="4" w:space="0"/>
+          <w:right w:val="none" w:color="000000" w:sz="4" w:space="0"/>
         </w:tcBorders>
       </w:tcPr>
     </w:tblStylePr>
@@ -29745,9 +29730,9 @@
         <w:shd w:val="clear" w:color="ffffff" w:themeColor="light1" w:fill="ffffff" w:themeFill="light1"/>
         <w:tcBorders>
           <w:top w:val="single" w:color="000000" w:themeColor="accent1" w:sz="4" w:space="0"/>
-          <w:left w:val="none"/>
-          <w:bottom w:val="none"/>
-          <w:right w:val="none"/>
+          <w:left w:val="none" w:color="000000" w:sz="4" w:space="0"/>
+          <w:bottom w:val="none" w:color="000000" w:sz="4" w:space="0"/>
+          <w:right w:val="none" w:color="000000" w:sz="4" w:space="0"/>
         </w:tcBorders>
       </w:tcPr>
     </w:tblStylePr>
@@ -29822,9 +29807,9 @@
       </w:tcPr>
     </w:tblStylePr>
   </w:style>
-  <w:style w:type="table" w:styleId="112">
+  <w:style w:type="table" w:styleId="846">
     <w:name w:val="List Table 7 Colorful - Accent 2"/>
-    <w:basedOn w:val="720"/>
+    <w:basedOn w:val="927"/>
     <w:uiPriority w:val="99"/>
     <w:pPr>
       <w:pBdr/>
@@ -29923,11 +29908,11 @@
         <w:tblBorders/>
       </w:tblPr>
       <w:tcPr>
-        <w:shd w:color="ffffff"/>
+        <w:shd w:val="clear" w:color="ffffff"/>
         <w:tcBorders>
-          <w:top w:val="none"/>
-          <w:left w:val="none"/>
-          <w:bottom w:val="none"/>
+          <w:top w:val="none" w:color="000000" w:sz="4" w:space="0"/>
+          <w:left w:val="none" w:color="000000" w:sz="4" w:space="0"/>
+          <w:bottom w:val="none" w:color="000000" w:sz="4" w:space="0"/>
           <w:right w:val="single" w:color="000000" w:themeColor="accent2" w:themeTint="97" w:sz="4" w:space="0"/>
         </w:tcBorders>
       </w:tcPr>
@@ -29950,10 +29935,10 @@
       <w:tcPr>
         <w:shd w:val="clear" w:color="ffffff" w:themeColor="light1" w:fill="ffffff" w:themeFill="light1"/>
         <w:tcBorders>
-          <w:top w:val="none"/>
-          <w:left w:val="none"/>
+          <w:top w:val="none" w:color="000000" w:sz="4" w:space="0"/>
+          <w:left w:val="none" w:color="000000" w:sz="4" w:space="0"/>
           <w:bottom w:val="single" w:color="000000" w:themeColor="accent2" w:themeTint="97" w:sz="4" w:space="0"/>
-          <w:right w:val="none"/>
+          <w:right w:val="none" w:color="000000" w:sz="4" w:space="0"/>
         </w:tcBorders>
       </w:tcPr>
     </w:tblStylePr>
@@ -29973,12 +29958,12 @@
         <w:tblBorders/>
       </w:tblPr>
       <w:tcPr>
-        <w:shd w:color="ffffff"/>
+        <w:shd w:val="clear" w:color="ffffff"/>
         <w:tcBorders>
-          <w:top w:val="none"/>
+          <w:top w:val="none" w:color="000000" w:sz="4" w:space="0"/>
           <w:left w:val="single" w:color="000000" w:themeColor="accent2" w:themeTint="97" w:sz="4" w:space="0"/>
-          <w:bottom w:val="none"/>
-          <w:right w:val="none"/>
+          <w:bottom w:val="none" w:color="000000" w:sz="4" w:space="0"/>
+          <w:right w:val="none" w:color="000000" w:sz="4" w:space="0"/>
         </w:tcBorders>
       </w:tcPr>
     </w:tblStylePr>
@@ -30001,9 +29986,9 @@
         <w:shd w:val="clear" w:color="ffffff" w:themeColor="light1" w:fill="ffffff" w:themeFill="light1"/>
         <w:tcBorders>
           <w:top w:val="single" w:color="000000" w:themeColor="accent2" w:themeTint="97" w:sz="4" w:space="0"/>
-          <w:left w:val="none"/>
-          <w:bottom w:val="none"/>
-          <w:right w:val="none"/>
+          <w:left w:val="none" w:color="000000" w:sz="4" w:space="0"/>
+          <w:bottom w:val="none" w:color="000000" w:sz="4" w:space="0"/>
+          <w:right w:val="none" w:color="000000" w:sz="4" w:space="0"/>
         </w:tcBorders>
       </w:tcPr>
     </w:tblStylePr>
@@ -30078,9 +30063,9 @@
       </w:tcPr>
     </w:tblStylePr>
   </w:style>
-  <w:style w:type="table" w:styleId="113">
+  <w:style w:type="table" w:styleId="847">
     <w:name w:val="List Table 7 Colorful - Accent 3"/>
-    <w:basedOn w:val="720"/>
+    <w:basedOn w:val="927"/>
     <w:uiPriority w:val="99"/>
     <w:pPr>
       <w:pBdr/>
@@ -30179,11 +30164,11 @@
         <w:tblBorders/>
       </w:tblPr>
       <w:tcPr>
-        <w:shd w:color="ffffff"/>
+        <w:shd w:val="clear" w:color="ffffff"/>
         <w:tcBorders>
-          <w:top w:val="none"/>
-          <w:left w:val="none"/>
-          <w:bottom w:val="none"/>
+          <w:top w:val="none" w:color="000000" w:sz="4" w:space="0"/>
+          <w:left w:val="none" w:color="000000" w:sz="4" w:space="0"/>
+          <w:bottom w:val="none" w:color="000000" w:sz="4" w:space="0"/>
           <w:right w:val="single" w:color="000000" w:themeColor="accent3" w:themeTint="98" w:sz="4" w:space="0"/>
         </w:tcBorders>
       </w:tcPr>
@@ -30206,10 +30191,10 @@
       <w:tcPr>
         <w:shd w:val="clear" w:color="ffffff" w:themeColor="light1" w:fill="ffffff" w:themeFill="light1"/>
         <w:tcBorders>
-          <w:top w:val="none"/>
-          <w:left w:val="none"/>
+          <w:top w:val="none" w:color="000000" w:sz="4" w:space="0"/>
+          <w:left w:val="none" w:color="000000" w:sz="4" w:space="0"/>
           <w:bottom w:val="single" w:color="000000" w:themeColor="accent3" w:themeTint="98" w:sz="4" w:space="0"/>
-          <w:right w:val="none"/>
+          <w:right w:val="none" w:color="000000" w:sz="4" w:space="0"/>
         </w:tcBorders>
       </w:tcPr>
     </w:tblStylePr>
@@ -30229,12 +30214,12 @@
         <w:tblBorders/>
       </w:tblPr>
       <w:tcPr>
-        <w:shd w:color="ffffff"/>
+        <w:shd w:val="clear" w:color="ffffff"/>
         <w:tcBorders>
-          <w:top w:val="none"/>
+          <w:top w:val="none" w:color="000000" w:sz="4" w:space="0"/>
           <w:left w:val="single" w:color="000000" w:themeColor="accent3" w:themeTint="98" w:sz="4" w:space="0"/>
-          <w:bottom w:val="none"/>
-          <w:right w:val="none"/>
+          <w:bottom w:val="none" w:color="000000" w:sz="4" w:space="0"/>
+          <w:right w:val="none" w:color="000000" w:sz="4" w:space="0"/>
         </w:tcBorders>
       </w:tcPr>
     </w:tblStylePr>
@@ -30257,9 +30242,9 @@
         <w:shd w:val="clear" w:color="ffffff" w:themeColor="light1" w:fill="ffffff" w:themeFill="light1"/>
         <w:tcBorders>
           <w:top w:val="single" w:color="000000" w:themeColor="accent3" w:themeTint="98" w:sz="4" w:space="0"/>
-          <w:left w:val="none"/>
-          <w:bottom w:val="none"/>
-          <w:right w:val="none"/>
+          <w:left w:val="none" w:color="000000" w:sz="4" w:space="0"/>
+          <w:bottom w:val="none" w:color="000000" w:sz="4" w:space="0"/>
+          <w:right w:val="none" w:color="000000" w:sz="4" w:space="0"/>
         </w:tcBorders>
       </w:tcPr>
     </w:tblStylePr>
@@ -30334,9 +30319,9 @@
       </w:tcPr>
     </w:tblStylePr>
   </w:style>
-  <w:style w:type="table" w:styleId="114">
+  <w:style w:type="table" w:styleId="848">
     <w:name w:val="List Table 7 Colorful - Accent 4"/>
-    <w:basedOn w:val="720"/>
+    <w:basedOn w:val="927"/>
     <w:uiPriority w:val="99"/>
     <w:pPr>
       <w:pBdr/>
@@ -30435,11 +30420,11 @@
         <w:tblBorders/>
       </w:tblPr>
       <w:tcPr>
-        <w:shd w:color="ffffff"/>
+        <w:shd w:val="clear" w:color="ffffff"/>
         <w:tcBorders>
-          <w:top w:val="none"/>
-          <w:left w:val="none"/>
-          <w:bottom w:val="none"/>
+          <w:top w:val="none" w:color="000000" w:sz="4" w:space="0"/>
+          <w:left w:val="none" w:color="000000" w:sz="4" w:space="0"/>
+          <w:bottom w:val="none" w:color="000000" w:sz="4" w:space="0"/>
           <w:right w:val="single" w:color="000000" w:themeColor="accent4" w:themeTint="9A" w:sz="4" w:space="0"/>
         </w:tcBorders>
       </w:tcPr>
@@ -30462,10 +30447,10 @@
       <w:tcPr>
         <w:shd w:val="clear" w:color="ffffff" w:themeColor="light1" w:fill="ffffff" w:themeFill="light1"/>
         <w:tcBorders>
-          <w:top w:val="none"/>
-          <w:left w:val="none"/>
+          <w:top w:val="none" w:color="000000" w:sz="4" w:space="0"/>
+          <w:left w:val="none" w:color="000000" w:sz="4" w:space="0"/>
           <w:bottom w:val="single" w:color="000000" w:themeColor="accent4" w:themeTint="9A" w:sz="4" w:space="0"/>
-          <w:right w:val="none"/>
+          <w:right w:val="none" w:color="000000" w:sz="4" w:space="0"/>
         </w:tcBorders>
       </w:tcPr>
     </w:tblStylePr>
@@ -30485,12 +30470,12 @@
         <w:tblBorders/>
       </w:tblPr>
       <w:tcPr>
-        <w:shd w:color="ffffff"/>
+        <w:shd w:val="clear" w:color="ffffff"/>
         <w:tcBorders>
-          <w:top w:val="none"/>
+          <w:top w:val="none" w:color="000000" w:sz="4" w:space="0"/>
           <w:left w:val="single" w:color="000000" w:themeColor="accent4" w:themeTint="9A" w:sz="4" w:space="0"/>
-          <w:bottom w:val="none"/>
-          <w:right w:val="none"/>
+          <w:bottom w:val="none" w:color="000000" w:sz="4" w:space="0"/>
+          <w:right w:val="none" w:color="000000" w:sz="4" w:space="0"/>
         </w:tcBorders>
       </w:tcPr>
     </w:tblStylePr>
@@ -30513,9 +30498,9 @@
         <w:shd w:val="clear" w:color="ffffff" w:themeColor="light1" w:fill="ffffff" w:themeFill="light1"/>
         <w:tcBorders>
           <w:top w:val="single" w:color="000000" w:themeColor="accent4" w:themeTint="9A" w:sz="4" w:space="0"/>
-          <w:left w:val="none"/>
-          <w:bottom w:val="none"/>
-          <w:right w:val="none"/>
+          <w:left w:val="none" w:color="000000" w:sz="4" w:space="0"/>
+          <w:bottom w:val="none" w:color="000000" w:sz="4" w:space="0"/>
+          <w:right w:val="none" w:color="000000" w:sz="4" w:space="0"/>
         </w:tcBorders>
       </w:tcPr>
     </w:tblStylePr>
@@ -30590,9 +30575,9 @@
       </w:tcPr>
     </w:tblStylePr>
   </w:style>
-  <w:style w:type="table" w:styleId="115">
+  <w:style w:type="table" w:styleId="849">
     <w:name w:val="List Table 7 Colorful - Accent 5"/>
-    <w:basedOn w:val="720"/>
+    <w:basedOn w:val="927"/>
     <w:uiPriority w:val="99"/>
     <w:pPr>
       <w:pBdr/>
@@ -30691,11 +30676,11 @@
         <w:tblBorders/>
       </w:tblPr>
       <w:tcPr>
-        <w:shd w:color="ffffff"/>
+        <w:shd w:val="clear" w:color="ffffff"/>
         <w:tcBorders>
-          <w:top w:val="none"/>
-          <w:left w:val="none"/>
-          <w:bottom w:val="none"/>
+          <w:top w:val="none" w:color="000000" w:sz="4" w:space="0"/>
+          <w:left w:val="none" w:color="000000" w:sz="4" w:space="0"/>
+          <w:bottom w:val="none" w:color="000000" w:sz="4" w:space="0"/>
           <w:right w:val="single" w:color="000000" w:themeColor="accent5" w:themeTint="9A" w:sz="4" w:space="0"/>
         </w:tcBorders>
       </w:tcPr>
@@ -30718,10 +30703,10 @@
       <w:tcPr>
         <w:shd w:val="clear" w:color="ffffff" w:themeColor="light1" w:fill="ffffff" w:themeFill="light1"/>
         <w:tcBorders>
-          <w:top w:val="none"/>
-          <w:left w:val="none"/>
+          <w:top w:val="none" w:color="000000" w:sz="4" w:space="0"/>
+          <w:left w:val="none" w:color="000000" w:sz="4" w:space="0"/>
           <w:bottom w:val="single" w:color="000000" w:themeColor="accent5" w:themeTint="9A" w:sz="4" w:space="0"/>
-          <w:right w:val="none"/>
+          <w:right w:val="none" w:color="000000" w:sz="4" w:space="0"/>
         </w:tcBorders>
       </w:tcPr>
     </w:tblStylePr>
@@ -30741,12 +30726,12 @@
         <w:tblBorders/>
       </w:tblPr>
       <w:tcPr>
-        <w:shd w:color="ffffff"/>
+        <w:shd w:val="clear" w:color="ffffff"/>
         <w:tcBorders>
-          <w:top w:val="none"/>
+          <w:top w:val="none" w:color="000000" w:sz="4" w:space="0"/>
           <w:left w:val="single" w:color="000000" w:themeColor="accent5" w:themeTint="9A" w:sz="4" w:space="0"/>
-          <w:bottom w:val="none"/>
-          <w:right w:val="none"/>
+          <w:bottom w:val="none" w:color="000000" w:sz="4" w:space="0"/>
+          <w:right w:val="none" w:color="000000" w:sz="4" w:space="0"/>
         </w:tcBorders>
       </w:tcPr>
     </w:tblStylePr>
@@ -30769,9 +30754,9 @@
         <w:shd w:val="clear" w:color="ffffff" w:themeColor="light1" w:fill="ffffff" w:themeFill="light1"/>
         <w:tcBorders>
           <w:top w:val="single" w:color="000000" w:themeColor="accent5" w:themeTint="9A" w:sz="4" w:space="0"/>
-          <w:left w:val="none"/>
-          <w:bottom w:val="none"/>
-          <w:right w:val="none"/>
+          <w:left w:val="none" w:color="000000" w:sz="4" w:space="0"/>
+          <w:bottom w:val="none" w:color="000000" w:sz="4" w:space="0"/>
+          <w:right w:val="none" w:color="000000" w:sz="4" w:space="0"/>
         </w:tcBorders>
       </w:tcPr>
     </w:tblStylePr>
@@ -30846,9 +30831,9 @@
       </w:tcPr>
     </w:tblStylePr>
   </w:style>
-  <w:style w:type="table" w:styleId="116">
+  <w:style w:type="table" w:styleId="850">
     <w:name w:val="List Table 7 Colorful - Accent 6"/>
-    <w:basedOn w:val="720"/>
+    <w:basedOn w:val="927"/>
     <w:uiPriority w:val="99"/>
     <w:pPr>
       <w:pBdr/>
@@ -30947,11 +30932,11 @@
         <w:tblBorders/>
       </w:tblPr>
       <w:tcPr>
-        <w:shd w:color="ffffff"/>
+        <w:shd w:val="clear" w:color="ffffff"/>
         <w:tcBorders>
-          <w:top w:val="none"/>
-          <w:left w:val="none"/>
-          <w:bottom w:val="none"/>
+          <w:top w:val="none" w:color="000000" w:sz="4" w:space="0"/>
+          <w:left w:val="none" w:color="000000" w:sz="4" w:space="0"/>
+          <w:bottom w:val="none" w:color="000000" w:sz="4" w:space="0"/>
           <w:right w:val="single" w:color="000000" w:themeColor="accent6" w:themeTint="98" w:sz="4" w:space="0"/>
         </w:tcBorders>
       </w:tcPr>
@@ -30974,10 +30959,10 @@
       <w:tcPr>
         <w:shd w:val="clear" w:color="ffffff" w:themeColor="light1" w:fill="ffffff" w:themeFill="light1"/>
         <w:tcBorders>
-          <w:top w:val="none"/>
-          <w:left w:val="none"/>
+          <w:top w:val="none" w:color="000000" w:sz="4" w:space="0"/>
+          <w:left w:val="none" w:color="000000" w:sz="4" w:space="0"/>
           <w:bottom w:val="single" w:color="000000" w:themeColor="accent6" w:themeTint="98" w:sz="4" w:space="0"/>
-          <w:right w:val="none"/>
+          <w:right w:val="none" w:color="000000" w:sz="4" w:space="0"/>
         </w:tcBorders>
       </w:tcPr>
     </w:tblStylePr>
@@ -30997,12 +30982,12 @@
         <w:tblBorders/>
       </w:tblPr>
       <w:tcPr>
-        <w:shd w:color="ffffff"/>
+        <w:shd w:val="clear" w:color="ffffff"/>
         <w:tcBorders>
-          <w:top w:val="none"/>
+          <w:top w:val="none" w:color="000000" w:sz="4" w:space="0"/>
           <w:left w:val="single" w:color="000000" w:themeColor="accent6" w:themeTint="98" w:sz="4" w:space="0"/>
-          <w:bottom w:val="none"/>
-          <w:right w:val="none"/>
+          <w:bottom w:val="none" w:color="000000" w:sz="4" w:space="0"/>
+          <w:right w:val="none" w:color="000000" w:sz="4" w:space="0"/>
         </w:tcBorders>
       </w:tcPr>
     </w:tblStylePr>
@@ -31025,9 +31010,9 @@
         <w:shd w:val="clear" w:color="ffffff" w:themeColor="light1" w:fill="ffffff" w:themeFill="light1"/>
         <w:tcBorders>
           <w:top w:val="single" w:color="000000" w:themeColor="accent6" w:themeTint="98" w:sz="4" w:space="0"/>
-          <w:left w:val="none"/>
-          <w:bottom w:val="none"/>
-          <w:right w:val="none"/>
+          <w:left w:val="none" w:color="000000" w:sz="4" w:space="0"/>
+          <w:bottom w:val="none" w:color="000000" w:sz="4" w:space="0"/>
+          <w:right w:val="none" w:color="000000" w:sz="4" w:space="0"/>
         </w:tcBorders>
       </w:tcPr>
     </w:tblStylePr>
@@ -31102,9 +31087,9 @@
       </w:tcPr>
     </w:tblStylePr>
   </w:style>
-  <w:style w:type="table" w:styleId="117">
+  <w:style w:type="table" w:styleId="851">
     <w:name w:val="Lined - Accent"/>
-    <w:basedOn w:val="720"/>
+    <w:basedOn w:val="927"/>
     <w:uiPriority w:val="99"/>
     <w:pPr>
       <w:pBdr/>
@@ -31339,9 +31324,9 @@
       </w:tcPr>
     </w:tblStylePr>
   </w:style>
-  <w:style w:type="table" w:styleId="118">
+  <w:style w:type="table" w:styleId="852">
     <w:name w:val="Lined - Accent 1"/>
-    <w:basedOn w:val="720"/>
+    <w:basedOn w:val="927"/>
     <w:uiPriority w:val="99"/>
     <w:pPr>
       <w:pBdr/>
@@ -31576,9 +31561,9 @@
       </w:tcPr>
     </w:tblStylePr>
   </w:style>
-  <w:style w:type="table" w:styleId="119">
+  <w:style w:type="table" w:styleId="853">
     <w:name w:val="Lined - Accent 2"/>
-    <w:basedOn w:val="720"/>
+    <w:basedOn w:val="927"/>
     <w:uiPriority w:val="99"/>
     <w:pPr>
       <w:pBdr/>
@@ -31813,9 +31798,9 @@
       </w:tcPr>
     </w:tblStylePr>
   </w:style>
-  <w:style w:type="table" w:styleId="120">
+  <w:style w:type="table" w:styleId="854">
     <w:name w:val="Lined - Accent 3"/>
-    <w:basedOn w:val="720"/>
+    <w:basedOn w:val="927"/>
     <w:uiPriority w:val="99"/>
     <w:pPr>
       <w:pBdr/>
@@ -32050,9 +32035,9 @@
       </w:tcPr>
     </w:tblStylePr>
   </w:style>
-  <w:style w:type="table" w:styleId="121">
+  <w:style w:type="table" w:styleId="855">
     <w:name w:val="Lined - Accent 4"/>
-    <w:basedOn w:val="720"/>
+    <w:basedOn w:val="927"/>
     <w:uiPriority w:val="99"/>
     <w:pPr>
       <w:pBdr/>
@@ -32287,9 +32272,9 @@
       </w:tcPr>
     </w:tblStylePr>
   </w:style>
-  <w:style w:type="table" w:styleId="122">
+  <w:style w:type="table" w:styleId="856">
     <w:name w:val="Lined - Accent 5"/>
-    <w:basedOn w:val="720"/>
+    <w:basedOn w:val="927"/>
     <w:uiPriority w:val="99"/>
     <w:pPr>
       <w:pBdr/>
@@ -32524,9 +32509,9 @@
       </w:tcPr>
     </w:tblStylePr>
   </w:style>
-  <w:style w:type="table" w:styleId="123">
+  <w:style w:type="table" w:styleId="857">
     <w:name w:val="Lined - Accent 6"/>
-    <w:basedOn w:val="720"/>
+    <w:basedOn w:val="927"/>
     <w:uiPriority w:val="99"/>
     <w:pPr>
       <w:pBdr/>
@@ -32761,9 +32746,9 @@
       </w:tcPr>
     </w:tblStylePr>
   </w:style>
-  <w:style w:type="table" w:styleId="124">
+  <w:style w:type="table" w:styleId="858">
     <w:name w:val="Bordered &amp; Lined - Accent"/>
-    <w:basedOn w:val="720"/>
+    <w:basedOn w:val="927"/>
     <w:uiPriority w:val="99"/>
     <w:pPr>
       <w:pBdr/>
@@ -33005,9 +32990,9 @@
       </w:tcPr>
     </w:tblStylePr>
   </w:style>
-  <w:style w:type="table" w:styleId="125">
+  <w:style w:type="table" w:styleId="859">
     <w:name w:val="Bordered &amp; Lined - Accent 1"/>
-    <w:basedOn w:val="720"/>
+    <w:basedOn w:val="927"/>
     <w:uiPriority w:val="99"/>
     <w:pPr>
       <w:pBdr/>
@@ -33249,9 +33234,9 @@
       </w:tcPr>
     </w:tblStylePr>
   </w:style>
-  <w:style w:type="table" w:styleId="126">
+  <w:style w:type="table" w:styleId="860">
     <w:name w:val="Bordered &amp; Lined - Accent 2"/>
-    <w:basedOn w:val="720"/>
+    <w:basedOn w:val="927"/>
     <w:uiPriority w:val="99"/>
     <w:pPr>
       <w:pBdr/>
@@ -33493,9 +33478,9 @@
       </w:tcPr>
     </w:tblStylePr>
   </w:style>
-  <w:style w:type="table" w:styleId="127">
+  <w:style w:type="table" w:styleId="861">
     <w:name w:val="Bordered &amp; Lined - Accent 3"/>
-    <w:basedOn w:val="720"/>
+    <w:basedOn w:val="927"/>
     <w:uiPriority w:val="99"/>
     <w:pPr>
       <w:pBdr/>
@@ -33737,9 +33722,9 @@
       </w:tcPr>
     </w:tblStylePr>
   </w:style>
-  <w:style w:type="table" w:styleId="128">
+  <w:style w:type="table" w:styleId="862">
     <w:name w:val="Bordered &amp; Lined - Accent 4"/>
-    <w:basedOn w:val="720"/>
+    <w:basedOn w:val="927"/>
     <w:uiPriority w:val="99"/>
     <w:pPr>
       <w:pBdr/>
@@ -33981,9 +33966,9 @@
       </w:tcPr>
     </w:tblStylePr>
   </w:style>
-  <w:style w:type="table" w:styleId="129">
+  <w:style w:type="table" w:styleId="863">
     <w:name w:val="Bordered &amp; Lined - Accent 5"/>
-    <w:basedOn w:val="720"/>
+    <w:basedOn w:val="927"/>
     <w:uiPriority w:val="99"/>
     <w:pPr>
       <w:pBdr/>
@@ -34225,9 +34210,9 @@
       </w:tcPr>
     </w:tblStylePr>
   </w:style>
-  <w:style w:type="table" w:styleId="130">
+  <w:style w:type="table" w:styleId="864">
     <w:name w:val="Bordered &amp; Lined - Accent 6"/>
-    <w:basedOn w:val="720"/>
+    <w:basedOn w:val="927"/>
     <w:uiPriority w:val="99"/>
     <w:pPr>
       <w:pBdr/>
@@ -34469,9 +34454,9 @@
       </w:tcPr>
     </w:tblStylePr>
   </w:style>
-  <w:style w:type="table" w:styleId="131">
+  <w:style w:type="table" w:styleId="865">
     <w:name w:val="Bordered"/>
-    <w:basedOn w:val="720"/>
+    <w:basedOn w:val="927"/>
     <w:uiPriority w:val="99"/>
     <w:pPr>
       <w:pBdr/>
@@ -34700,9 +34685,9 @@
       </w:tcPr>
     </w:tblStylePr>
   </w:style>
-  <w:style w:type="table" w:styleId="132">
+  <w:style w:type="table" w:styleId="866">
     <w:name w:val="Bordered - Accent 1"/>
-    <w:basedOn w:val="720"/>
+    <w:basedOn w:val="927"/>
     <w:uiPriority w:val="99"/>
     <w:pPr>
       <w:pBdr/>
@@ -34931,9 +34916,9 @@
       </w:tcPr>
     </w:tblStylePr>
   </w:style>
-  <w:style w:type="table" w:styleId="133">
+  <w:style w:type="table" w:styleId="867">
     <w:name w:val="Bordered - Accent 2"/>
-    <w:basedOn w:val="720"/>
+    <w:basedOn w:val="927"/>
     <w:uiPriority w:val="99"/>
     <w:pPr>
       <w:pBdr/>
@@ -35162,9 +35147,9 @@
       </w:tcPr>
     </w:tblStylePr>
   </w:style>
-  <w:style w:type="table" w:styleId="134">
+  <w:style w:type="table" w:styleId="868">
     <w:name w:val="Bordered - Accent 3"/>
-    <w:basedOn w:val="720"/>
+    <w:basedOn w:val="927"/>
     <w:uiPriority w:val="99"/>
     <w:pPr>
       <w:pBdr/>
@@ -35393,9 +35378,9 @@
       </w:tcPr>
     </w:tblStylePr>
   </w:style>
-  <w:style w:type="table" w:styleId="135">
+  <w:style w:type="table" w:styleId="869">
     <w:name w:val="Bordered - Accent 4"/>
-    <w:basedOn w:val="720"/>
+    <w:basedOn w:val="927"/>
     <w:uiPriority w:val="99"/>
     <w:pPr>
       <w:pBdr/>
@@ -35624,9 +35609,9 @@
       </w:tcPr>
     </w:tblStylePr>
   </w:style>
-  <w:style w:type="table" w:styleId="136">
+  <w:style w:type="table" w:styleId="870">
     <w:name w:val="Bordered - Accent 5"/>
-    <w:basedOn w:val="720"/>
+    <w:basedOn w:val="927"/>
     <w:uiPriority w:val="99"/>
     <w:pPr>
       <w:pBdr/>
@@ -35855,9 +35840,9 @@
       </w:tcPr>
     </w:tblStylePr>
   </w:style>
-  <w:style w:type="table" w:styleId="137">
+  <w:style w:type="table" w:styleId="871">
     <w:name w:val="Bordered - Accent 6"/>
-    <w:basedOn w:val="720"/>
+    <w:basedOn w:val="927"/>
     <w:uiPriority w:val="99"/>
     <w:pPr>
       <w:pBdr/>
@@ -36086,10 +36071,10 @@
       </w:tcPr>
     </w:tblStylePr>
   </w:style>
-  <w:style w:type="character" w:styleId="150">
+  <w:style w:type="character" w:styleId="872">
     <w:name w:val="Heading 1 Char"/>
-    <w:basedOn w:val="719"/>
-    <w:link w:val="710"/>
+    <w:basedOn w:val="926"/>
+    <w:link w:val="917"/>
     <w:uiPriority w:val="9"/>
     <w:pPr>
       <w:pBdr/>
@@ -36103,10 +36088,10 @@
       <w:szCs w:val="40"/>
     </w:rPr>
   </w:style>
-  <w:style w:type="character" w:styleId="151">
+  <w:style w:type="character" w:styleId="873">
     <w:name w:val="Heading 2 Char"/>
-    <w:basedOn w:val="719"/>
-    <w:link w:val="711"/>
+    <w:basedOn w:val="926"/>
+    <w:link w:val="918"/>
     <w:uiPriority w:val="9"/>
     <w:pPr>
       <w:pBdr/>
@@ -36120,10 +36105,10 @@
       <w:szCs w:val="32"/>
     </w:rPr>
   </w:style>
-  <w:style w:type="character" w:styleId="152">
+  <w:style w:type="character" w:styleId="874">
     <w:name w:val="Heading 3 Char"/>
-    <w:basedOn w:val="719"/>
-    <w:link w:val="712"/>
+    <w:basedOn w:val="926"/>
+    <w:link w:val="919"/>
     <w:uiPriority w:val="9"/>
     <w:pPr>
       <w:pBdr/>
@@ -36137,10 +36122,10 @@
       <w:szCs w:val="28"/>
     </w:rPr>
   </w:style>
-  <w:style w:type="character" w:styleId="153">
+  <w:style w:type="character" w:styleId="875">
     <w:name w:val="Heading 4 Char"/>
-    <w:basedOn w:val="719"/>
-    <w:link w:val="713"/>
+    <w:basedOn w:val="926"/>
+    <w:link w:val="920"/>
     <w:uiPriority w:val="9"/>
     <w:pPr>
       <w:pBdr/>
@@ -36154,10 +36139,10 @@
       <w:color w:val="0f4761" w:themeColor="accent1" w:themeShade="BF"/>
     </w:rPr>
   </w:style>
-  <w:style w:type="character" w:styleId="154">
+  <w:style w:type="character" w:styleId="876">
     <w:name w:val="Heading 5 Char"/>
-    <w:basedOn w:val="719"/>
-    <w:link w:val="714"/>
+    <w:basedOn w:val="926"/>
+    <w:link w:val="921"/>
     <w:uiPriority w:val="9"/>
     <w:pPr>
       <w:pBdr/>
@@ -36169,10 +36154,10 @@
       <w:color w:val="0f4761" w:themeColor="accent1" w:themeShade="BF"/>
     </w:rPr>
   </w:style>
-  <w:style w:type="character" w:styleId="155">
+  <w:style w:type="character" w:styleId="877">
     <w:name w:val="Heading 6 Char"/>
-    <w:basedOn w:val="719"/>
-    <w:link w:val="715"/>
+    <w:basedOn w:val="926"/>
+    <w:link w:val="922"/>
     <w:uiPriority w:val="9"/>
     <w:pPr>
       <w:pBdr/>
@@ -36186,10 +36171,10 @@
       <w:color w:val="595959" w:themeColor="text1" w:themeTint="A6"/>
     </w:rPr>
   </w:style>
-  <w:style w:type="character" w:styleId="156">
+  <w:style w:type="character" w:styleId="878">
     <w:name w:val="Heading 7 Char"/>
-    <w:basedOn w:val="719"/>
-    <w:link w:val="716"/>
+    <w:basedOn w:val="926"/>
+    <w:link w:val="923"/>
     <w:uiPriority w:val="9"/>
     <w:pPr>
       <w:pBdr/>
@@ -36201,10 +36186,10 @@
       <w:color w:val="595959" w:themeColor="text1" w:themeTint="A6"/>
     </w:rPr>
   </w:style>
-  <w:style w:type="character" w:styleId="157">
+  <w:style w:type="character" w:styleId="879">
     <w:name w:val="Heading 8 Char"/>
-    <w:basedOn w:val="719"/>
-    <w:link w:val="717"/>
+    <w:basedOn w:val="926"/>
+    <w:link w:val="924"/>
     <w:uiPriority w:val="9"/>
     <w:pPr>
       <w:pBdr/>
@@ -36218,10 +36203,10 @@
       <w:color w:val="272727" w:themeColor="text1" w:themeTint="D8"/>
     </w:rPr>
   </w:style>
-  <w:style w:type="character" w:styleId="158">
+  <w:style w:type="character" w:styleId="880">
     <w:name w:val="Heading 9 Char"/>
-    <w:basedOn w:val="719"/>
-    <w:link w:val="718"/>
+    <w:basedOn w:val="926"/>
+    <w:link w:val="925"/>
     <w:uiPriority w:val="9"/>
     <w:pPr>
       <w:pBdr/>
@@ -36235,10 +36220,10 @@
       <w:color w:val="272727" w:themeColor="text1" w:themeTint="D8"/>
     </w:rPr>
   </w:style>
-  <w:style w:type="character" w:styleId="160">
+  <w:style w:type="character" w:styleId="881">
     <w:name w:val="Title Char"/>
-    <w:basedOn w:val="719"/>
-    <w:link w:val="731"/>
+    <w:basedOn w:val="926"/>
+    <w:link w:val="938"/>
     <w:uiPriority w:val="10"/>
     <w:pPr>
       <w:pBdr/>
@@ -36252,10 +36237,10 @@
       <w:szCs w:val="56"/>
     </w:rPr>
   </w:style>
-  <w:style w:type="character" w:styleId="162">
+  <w:style w:type="character" w:styleId="882">
     <w:name w:val="Subtitle Char"/>
-    <w:basedOn w:val="719"/>
-    <w:link w:val="733"/>
+    <w:basedOn w:val="926"/>
+    <w:link w:val="940"/>
     <w:uiPriority w:val="11"/>
     <w:pPr>
       <w:pBdr/>
@@ -36269,10 +36254,10 @@
       <w:szCs w:val="28"/>
     </w:rPr>
   </w:style>
-  <w:style w:type="character" w:styleId="164">
+  <w:style w:type="character" w:styleId="883">
     <w:name w:val="Quote Char"/>
-    <w:basedOn w:val="719"/>
-    <w:link w:val="735"/>
+    <w:basedOn w:val="926"/>
+    <w:link w:val="942"/>
     <w:uiPriority w:val="29"/>
     <w:pPr>
       <w:pBdr/>
@@ -36285,10 +36270,10 @@
       <w:color w:val="404040" w:themeColor="text1" w:themeTint="BF"/>
     </w:rPr>
   </w:style>
-  <w:style w:type="character" w:styleId="168">
+  <w:style w:type="character" w:styleId="884">
     <w:name w:val="Intense Quote Char"/>
-    <w:basedOn w:val="719"/>
-    <w:link w:val="739"/>
+    <w:basedOn w:val="926"/>
+    <w:link w:val="946"/>
     <w:uiPriority w:val="30"/>
     <w:pPr>
       <w:pBdr/>
@@ -36301,9 +36286,9 @@
       <w:color w:val="0f4761" w:themeColor="accent1" w:themeShade="BF"/>
     </w:rPr>
   </w:style>
-  <w:style w:type="paragraph" w:styleId="170">
+  <w:style w:type="paragraph" w:styleId="885">
     <w:name w:val="No Spacing"/>
-    <w:basedOn w:val="709"/>
+    <w:basedOn w:val="916"/>
     <w:uiPriority w:val="1"/>
     <w:qFormat/>
     <w:pPr>
@@ -36312,9 +36297,9 @@
       <w:ind/>
     </w:pPr>
   </w:style>
-  <w:style w:type="character" w:styleId="171">
+  <w:style w:type="character" w:styleId="886">
     <w:name w:val="Subtle Emphasis"/>
-    <w:basedOn w:val="719"/>
+    <w:basedOn w:val="926"/>
     <w:uiPriority w:val="19"/>
     <w:qFormat/>
     <w:pPr>
@@ -36328,9 +36313,9 @@
       <w:color w:val="404040" w:themeColor="text1" w:themeTint="BF"/>
     </w:rPr>
   </w:style>
-  <w:style w:type="character" w:styleId="172">
+  <w:style w:type="character" w:styleId="887">
     <w:name w:val="Emphasis"/>
-    <w:basedOn w:val="719"/>
+    <w:basedOn w:val="926"/>
     <w:uiPriority w:val="20"/>
     <w:qFormat/>
     <w:pPr>
@@ -36343,9 +36328,9 @@
       <w:iCs/>
     </w:rPr>
   </w:style>
-  <w:style w:type="character" w:styleId="173">
+  <w:style w:type="character" w:styleId="888">
     <w:name w:val="Strong"/>
-    <w:basedOn w:val="719"/>
+    <w:basedOn w:val="926"/>
     <w:uiPriority w:val="22"/>
     <w:qFormat/>
     <w:pPr>
@@ -36358,9 +36343,9 @@
       <w:bCs/>
     </w:rPr>
   </w:style>
-  <w:style w:type="character" w:styleId="174">
+  <w:style w:type="character" w:styleId="889">
     <w:name w:val="Subtle Reference"/>
-    <w:basedOn w:val="719"/>
+    <w:basedOn w:val="926"/>
     <w:uiPriority w:val="31"/>
     <w:qFormat/>
     <w:pPr>
@@ -36373,9 +36358,9 @@
       <w:color w:val="5a5a5a" w:themeColor="text1" w:themeTint="A5"/>
     </w:rPr>
   </w:style>
-  <w:style w:type="character" w:styleId="175">
+  <w:style w:type="character" w:styleId="890">
     <w:name w:val="Book Title"/>
-    <w:basedOn w:val="719"/>
+    <w:basedOn w:val="926"/>
     <w:uiPriority w:val="33"/>
     <w:qFormat/>
     <w:pPr>
@@ -36391,10 +36376,10 @@
       <w:spacing w:val="5"/>
     </w:rPr>
   </w:style>
-  <w:style w:type="paragraph" w:styleId="176">
+  <w:style w:type="paragraph" w:styleId="891">
     <w:name w:val="Header"/>
-    <w:basedOn w:val="709"/>
-    <w:link w:val="177"/>
+    <w:basedOn w:val="916"/>
+    <w:link w:val="892"/>
     <w:uiPriority w:val="99"/>
     <w:unhideWhenUsed/>
     <w:pPr>
@@ -36407,10 +36392,10 @@
       <w:ind/>
     </w:pPr>
   </w:style>
-  <w:style w:type="character" w:styleId="177">
+  <w:style w:type="character" w:styleId="892">
     <w:name w:val="Header Char"/>
-    <w:basedOn w:val="719"/>
-    <w:link w:val="176"/>
+    <w:basedOn w:val="926"/>
+    <w:link w:val="891"/>
     <w:uiPriority w:val="99"/>
     <w:pPr>
       <w:pBdr/>
@@ -36418,10 +36403,10 @@
       <w:ind/>
     </w:pPr>
   </w:style>
-  <w:style w:type="paragraph" w:styleId="178">
+  <w:style w:type="paragraph" w:styleId="893">
     <w:name w:val="Footer"/>
-    <w:basedOn w:val="709"/>
-    <w:link w:val="179"/>
+    <w:basedOn w:val="916"/>
+    <w:link w:val="894"/>
     <w:uiPriority w:val="99"/>
     <w:unhideWhenUsed/>
     <w:pPr>
@@ -36434,10 +36419,10 @@
       <w:ind/>
     </w:pPr>
   </w:style>
-  <w:style w:type="character" w:styleId="179">
+  <w:style w:type="character" w:styleId="894">
     <w:name w:val="Footer Char"/>
-    <w:basedOn w:val="719"/>
-    <w:link w:val="178"/>
+    <w:basedOn w:val="926"/>
+    <w:link w:val="893"/>
     <w:uiPriority w:val="99"/>
     <w:pPr>
       <w:pBdr/>
@@ -36445,10 +36430,10 @@
       <w:ind/>
     </w:pPr>
   </w:style>
-  <w:style w:type="paragraph" w:styleId="180">
+  <w:style w:type="paragraph" w:styleId="895">
     <w:name w:val="Caption"/>
-    <w:basedOn w:val="709"/>
-    <w:next w:val="709"/>
+    <w:basedOn w:val="916"/>
+    <w:next w:val="916"/>
     <w:uiPriority w:val="35"/>
     <w:unhideWhenUsed/>
     <w:qFormat/>
@@ -36465,10 +36450,10 @@
       <w:szCs w:val="18"/>
     </w:rPr>
   </w:style>
-  <w:style w:type="paragraph" w:styleId="181">
+  <w:style w:type="paragraph" w:styleId="896">
     <w:name w:val="footnote text"/>
-    <w:basedOn w:val="709"/>
-    <w:link w:val="182"/>
+    <w:basedOn w:val="916"/>
+    <w:link w:val="897"/>
     <w:uiPriority w:val="99"/>
     <w:semiHidden/>
     <w:unhideWhenUsed/>
@@ -36482,10 +36467,10 @@
       <w:szCs w:val="20"/>
     </w:rPr>
   </w:style>
-  <w:style w:type="character" w:styleId="182">
+  <w:style w:type="character" w:styleId="897">
     <w:name w:val="Footnote Text Char"/>
-    <w:basedOn w:val="719"/>
-    <w:link w:val="181"/>
+    <w:basedOn w:val="926"/>
+    <w:link w:val="896"/>
     <w:uiPriority w:val="99"/>
     <w:semiHidden/>
     <w:pPr>
@@ -36498,9 +36483,9 @@
       <w:szCs w:val="20"/>
     </w:rPr>
   </w:style>
-  <w:style w:type="character" w:styleId="183">
+  <w:style w:type="character" w:styleId="898">
     <w:name w:val="footnote reference"/>
-    <w:basedOn w:val="719"/>
+    <w:basedOn w:val="926"/>
     <w:uiPriority w:val="99"/>
     <w:semiHidden/>
     <w:unhideWhenUsed/>
@@ -36513,10 +36498,10 @@
       <w:vertAlign w:val="superscript"/>
     </w:rPr>
   </w:style>
-  <w:style w:type="paragraph" w:styleId="184">
+  <w:style w:type="paragraph" w:styleId="899">
     <w:name w:val="endnote text"/>
-    <w:basedOn w:val="709"/>
-    <w:link w:val="185"/>
+    <w:basedOn w:val="916"/>
+    <w:link w:val="900"/>
     <w:uiPriority w:val="99"/>
     <w:semiHidden/>
     <w:unhideWhenUsed/>
@@ -36530,10 +36515,10 @@
       <w:szCs w:val="20"/>
     </w:rPr>
   </w:style>
-  <w:style w:type="character" w:styleId="185">
+  <w:style w:type="character" w:styleId="900">
     <w:name w:val="Endnote Text Char"/>
-    <w:basedOn w:val="719"/>
-    <w:link w:val="184"/>
+    <w:basedOn w:val="926"/>
+    <w:link w:val="899"/>
     <w:uiPriority w:val="99"/>
     <w:semiHidden/>
     <w:pPr>
@@ -36546,9 +36531,9 @@
       <w:szCs w:val="20"/>
     </w:rPr>
   </w:style>
-  <w:style w:type="character" w:styleId="186">
+  <w:style w:type="character" w:styleId="901">
     <w:name w:val="endnote reference"/>
-    <w:basedOn w:val="719"/>
+    <w:basedOn w:val="926"/>
     <w:uiPriority w:val="99"/>
     <w:semiHidden/>
     <w:unhideWhenUsed/>
@@ -36561,9 +36546,9 @@
       <w:vertAlign w:val="superscript"/>
     </w:rPr>
   </w:style>
-  <w:style w:type="character" w:styleId="187">
+  <w:style w:type="character" w:styleId="902">
     <w:name w:val="Hyperlink"/>
-    <w:basedOn w:val="719"/>
+    <w:basedOn w:val="926"/>
     <w:uiPriority w:val="99"/>
     <w:unhideWhenUsed/>
     <w:pPr>
@@ -36576,9 +36561,9 @@
       <w:u w:val="single"/>
     </w:rPr>
   </w:style>
-  <w:style w:type="character" w:styleId="188">
+  <w:style w:type="character" w:styleId="903">
     <w:name w:val="FollowedHyperlink"/>
-    <w:basedOn w:val="719"/>
+    <w:basedOn w:val="926"/>
     <w:uiPriority w:val="99"/>
     <w:semiHidden/>
     <w:unhideWhenUsed/>
@@ -36592,10 +36577,10 @@
       <w:u w:val="single"/>
     </w:rPr>
   </w:style>
-  <w:style w:type="paragraph" w:styleId="189">
+  <w:style w:type="paragraph" w:styleId="904">
     <w:name w:val="toc 1"/>
-    <w:basedOn w:val="709"/>
-    <w:next w:val="709"/>
+    <w:basedOn w:val="916"/>
+    <w:next w:val="916"/>
     <w:uiPriority w:val="39"/>
     <w:unhideWhenUsed/>
     <w:pPr>
@@ -36604,10 +36589,10 @@
       <w:ind/>
     </w:pPr>
   </w:style>
-  <w:style w:type="paragraph" w:styleId="190">
+  <w:style w:type="paragraph" w:styleId="905">
     <w:name w:val="toc 2"/>
-    <w:basedOn w:val="709"/>
-    <w:next w:val="709"/>
+    <w:basedOn w:val="916"/>
+    <w:next w:val="916"/>
     <w:uiPriority w:val="39"/>
     <w:unhideWhenUsed/>
     <w:pPr>
@@ -36616,10 +36601,10 @@
       <w:ind w:left="220"/>
     </w:pPr>
   </w:style>
-  <w:style w:type="paragraph" w:styleId="191">
+  <w:style w:type="paragraph" w:styleId="906">
     <w:name w:val="toc 3"/>
-    <w:basedOn w:val="709"/>
-    <w:next w:val="709"/>
+    <w:basedOn w:val="916"/>
+    <w:next w:val="916"/>
     <w:uiPriority w:val="39"/>
     <w:unhideWhenUsed/>
     <w:pPr>
@@ -36628,10 +36613,10 @@
       <w:ind w:left="440"/>
     </w:pPr>
   </w:style>
-  <w:style w:type="paragraph" w:styleId="192">
+  <w:style w:type="paragraph" w:styleId="907">
     <w:name w:val="toc 4"/>
-    <w:basedOn w:val="709"/>
-    <w:next w:val="709"/>
+    <w:basedOn w:val="916"/>
+    <w:next w:val="916"/>
     <w:uiPriority w:val="39"/>
     <w:unhideWhenUsed/>
     <w:pPr>
@@ -36640,10 +36625,10 @@
       <w:ind w:left="660"/>
     </w:pPr>
   </w:style>
-  <w:style w:type="paragraph" w:styleId="193">
+  <w:style w:type="paragraph" w:styleId="908">
     <w:name w:val="toc 5"/>
-    <w:basedOn w:val="709"/>
-    <w:next w:val="709"/>
+    <w:basedOn w:val="916"/>
+    <w:next w:val="916"/>
     <w:uiPriority w:val="39"/>
     <w:unhideWhenUsed/>
     <w:pPr>
@@ -36652,10 +36637,10 @@
       <w:ind w:left="880"/>
     </w:pPr>
   </w:style>
-  <w:style w:type="paragraph" w:styleId="194">
+  <w:style w:type="paragraph" w:styleId="909">
     <w:name w:val="toc 6"/>
-    <w:basedOn w:val="709"/>
-    <w:next w:val="709"/>
+    <w:basedOn w:val="916"/>
+    <w:next w:val="916"/>
     <w:uiPriority w:val="39"/>
     <w:unhideWhenUsed/>
     <w:pPr>
@@ -36664,10 +36649,10 @@
       <w:ind w:left="1100"/>
     </w:pPr>
   </w:style>
-  <w:style w:type="paragraph" w:styleId="195">
+  <w:style w:type="paragraph" w:styleId="910">
     <w:name w:val="toc 7"/>
-    <w:basedOn w:val="709"/>
-    <w:next w:val="709"/>
+    <w:basedOn w:val="916"/>
+    <w:next w:val="916"/>
     <w:uiPriority w:val="39"/>
     <w:unhideWhenUsed/>
     <w:pPr>
@@ -36676,10 +36661,10 @@
       <w:ind w:left="1320"/>
     </w:pPr>
   </w:style>
-  <w:style w:type="paragraph" w:styleId="196">
+  <w:style w:type="paragraph" w:styleId="911">
     <w:name w:val="toc 8"/>
-    <w:basedOn w:val="709"/>
-    <w:next w:val="709"/>
+    <w:basedOn w:val="916"/>
+    <w:next w:val="916"/>
     <w:uiPriority w:val="39"/>
     <w:unhideWhenUsed/>
     <w:pPr>
@@ -36688,10 +36673,10 @@
       <w:ind w:left="1540"/>
     </w:pPr>
   </w:style>
-  <w:style w:type="paragraph" w:styleId="197">
+  <w:style w:type="paragraph" w:styleId="912">
     <w:name w:val="toc 9"/>
-    <w:basedOn w:val="709"/>
-    <w:next w:val="709"/>
+    <w:basedOn w:val="916"/>
+    <w:next w:val="916"/>
     <w:uiPriority w:val="39"/>
     <w:unhideWhenUsed/>
     <w:pPr>
@@ -36700,9 +36685,9 @@
       <w:ind w:left="1760"/>
     </w:pPr>
   </w:style>
-  <w:style w:type="character" w:styleId="198">
+  <w:style w:type="character" w:styleId="913">
     <w:name w:val="Placeholder Text"/>
-    <w:basedOn w:val="719"/>
+    <w:basedOn w:val="926"/>
     <w:uiPriority w:val="99"/>
     <w:semiHidden/>
     <w:pPr>
@@ -36714,7 +36699,7 @@
       <w:color w:val="666666"/>
     </w:rPr>
   </w:style>
-  <w:style w:type="paragraph" w:styleId="208">
+  <w:style w:type="paragraph" w:styleId="914">
     <w:name w:val="TOC Heading"/>
     <w:uiPriority w:val="39"/>
     <w:unhideWhenUsed/>
@@ -36724,10 +36709,10 @@
       <w:ind/>
     </w:pPr>
   </w:style>
-  <w:style w:type="paragraph" w:styleId="209">
+  <w:style w:type="paragraph" w:styleId="915">
     <w:name w:val="table of figures"/>
-    <w:basedOn w:val="709"/>
-    <w:next w:val="709"/>
+    <w:basedOn w:val="916"/>
+    <w:next w:val="916"/>
     <w:uiPriority w:val="99"/>
     <w:unhideWhenUsed/>
     <w:pPr>
@@ -36736,7 +36721,7 @@
       <w:ind/>
     </w:pPr>
   </w:style>
-  <w:style w:type="paragraph" w:styleId="709" w:default="1">
+  <w:style w:type="paragraph" w:styleId="916" w:default="1">
     <w:name w:val="Normal"/>
     <w:qFormat/>
     <w:pPr>
@@ -36745,11 +36730,11 @@
       <w:ind/>
     </w:pPr>
   </w:style>
-  <w:style w:type="paragraph" w:styleId="710">
+  <w:style w:type="paragraph" w:styleId="917">
     <w:name w:val="Heading 1"/>
-    <w:basedOn w:val="709"/>
-    <w:next w:val="709"/>
-    <w:link w:val="722"/>
+    <w:basedOn w:val="916"/>
+    <w:next w:val="916"/>
+    <w:link w:val="929"/>
     <w:uiPriority w:val="9"/>
     <w:qFormat/>
     <w:pPr>
@@ -36767,11 +36752,11 @@
       <w:szCs w:val="40"/>
     </w:rPr>
   </w:style>
-  <w:style w:type="paragraph" w:styleId="711">
+  <w:style w:type="paragraph" w:styleId="918">
     <w:name w:val="Heading 2"/>
-    <w:basedOn w:val="709"/>
-    <w:next w:val="709"/>
-    <w:link w:val="723"/>
+    <w:basedOn w:val="916"/>
+    <w:next w:val="916"/>
+    <w:link w:val="930"/>
     <w:uiPriority w:val="9"/>
     <w:semiHidden/>
     <w:unhideWhenUsed/>
@@ -36791,11 +36776,11 @@
       <w:szCs w:val="32"/>
     </w:rPr>
   </w:style>
-  <w:style w:type="paragraph" w:styleId="712">
+  <w:style w:type="paragraph" w:styleId="919">
     <w:name w:val="Heading 3"/>
-    <w:basedOn w:val="709"/>
-    <w:next w:val="709"/>
-    <w:link w:val="724"/>
+    <w:basedOn w:val="916"/>
+    <w:next w:val="916"/>
+    <w:link w:val="931"/>
     <w:uiPriority w:val="9"/>
     <w:semiHidden/>
     <w:unhideWhenUsed/>
@@ -36815,11 +36800,11 @@
       <w:szCs w:val="28"/>
     </w:rPr>
   </w:style>
-  <w:style w:type="paragraph" w:styleId="713">
+  <w:style w:type="paragraph" w:styleId="920">
     <w:name w:val="Heading 4"/>
-    <w:basedOn w:val="709"/>
-    <w:next w:val="709"/>
-    <w:link w:val="725"/>
+    <w:basedOn w:val="916"/>
+    <w:next w:val="916"/>
+    <w:link w:val="932"/>
     <w:uiPriority w:val="9"/>
     <w:semiHidden/>
     <w:unhideWhenUsed/>
@@ -36839,11 +36824,11 @@
       <w:color w:val="0f4761" w:themeColor="accent1" w:themeShade="BF"/>
     </w:rPr>
   </w:style>
-  <w:style w:type="paragraph" w:styleId="714">
+  <w:style w:type="paragraph" w:styleId="921">
     <w:name w:val="Heading 5"/>
-    <w:basedOn w:val="709"/>
-    <w:next w:val="709"/>
-    <w:link w:val="726"/>
+    <w:basedOn w:val="916"/>
+    <w:next w:val="916"/>
+    <w:link w:val="933"/>
     <w:uiPriority w:val="9"/>
     <w:semiHidden/>
     <w:unhideWhenUsed/>
@@ -36861,11 +36846,11 @@
       <w:color w:val="0f4761" w:themeColor="accent1" w:themeShade="BF"/>
     </w:rPr>
   </w:style>
-  <w:style w:type="paragraph" w:styleId="715">
+  <w:style w:type="paragraph" w:styleId="922">
     <w:name w:val="Heading 6"/>
-    <w:basedOn w:val="709"/>
-    <w:next w:val="709"/>
-    <w:link w:val="727"/>
+    <w:basedOn w:val="916"/>
+    <w:next w:val="916"/>
+    <w:link w:val="934"/>
     <w:uiPriority w:val="9"/>
     <w:semiHidden/>
     <w:unhideWhenUsed/>
@@ -36885,11 +36870,11 @@
       <w:color w:val="595959" w:themeColor="text1" w:themeTint="A6"/>
     </w:rPr>
   </w:style>
-  <w:style w:type="paragraph" w:styleId="716">
+  <w:style w:type="paragraph" w:styleId="923">
     <w:name w:val="Heading 7"/>
-    <w:basedOn w:val="709"/>
-    <w:next w:val="709"/>
-    <w:link w:val="728"/>
+    <w:basedOn w:val="916"/>
+    <w:next w:val="916"/>
+    <w:link w:val="935"/>
     <w:uiPriority w:val="9"/>
     <w:semiHidden/>
     <w:unhideWhenUsed/>
@@ -36907,11 +36892,11 @@
       <w:color w:val="595959" w:themeColor="text1" w:themeTint="A6"/>
     </w:rPr>
   </w:style>
-  <w:style w:type="paragraph" w:styleId="717">
+  <w:style w:type="paragraph" w:styleId="924">
     <w:name w:val="Heading 8"/>
-    <w:basedOn w:val="709"/>
-    <w:next w:val="709"/>
-    <w:link w:val="729"/>
+    <w:basedOn w:val="916"/>
+    <w:next w:val="916"/>
+    <w:link w:val="936"/>
     <w:uiPriority w:val="9"/>
     <w:semiHidden/>
     <w:unhideWhenUsed/>
@@ -36931,11 +36916,11 @@
       <w:color w:val="272727" w:themeColor="text1" w:themeTint="D8"/>
     </w:rPr>
   </w:style>
-  <w:style w:type="paragraph" w:styleId="718">
+  <w:style w:type="paragraph" w:styleId="925">
     <w:name w:val="Heading 9"/>
-    <w:basedOn w:val="709"/>
-    <w:next w:val="709"/>
-    <w:link w:val="730"/>
+    <w:basedOn w:val="916"/>
+    <w:next w:val="916"/>
+    <w:link w:val="937"/>
     <w:uiPriority w:val="9"/>
     <w:semiHidden/>
     <w:unhideWhenUsed/>
@@ -36953,7 +36938,7 @@
       <w:color w:val="272727" w:themeColor="text1" w:themeTint="D8"/>
     </w:rPr>
   </w:style>
-  <w:style w:type="character" w:styleId="719" w:default="1">
+  <w:style w:type="character" w:styleId="926" w:default="1">
     <w:name w:val="Default Paragraph Font"/>
     <w:uiPriority w:val="1"/>
     <w:unhideWhenUsed/>
@@ -36963,7 +36948,7 @@
       <w:ind/>
     </w:pPr>
   </w:style>
-  <w:style w:type="table" w:styleId="720" w:default="1">
+  <w:style w:type="table" w:styleId="927" w:default="1">
     <w:name w:val="Normal Table"/>
     <w:uiPriority w:val="99"/>
     <w:semiHidden/>
@@ -37156,7 +37141,7 @@
       </w:tcPr>
     </w:tblStylePr>
   </w:style>
-  <w:style w:type="numbering" w:styleId="721" w:default="1">
+  <w:style w:type="numbering" w:styleId="928" w:default="1">
     <w:name w:val="No List"/>
     <w:uiPriority w:val="99"/>
     <w:semiHidden/>
@@ -37167,10 +37152,10 @@
       <w:ind/>
     </w:pPr>
   </w:style>
-  <w:style w:type="character" w:styleId="722" w:customStyle="1">
+  <w:style w:type="character" w:styleId="929" w:customStyle="1">
     <w:name w:val="Kop 1 Char"/>
-    <w:basedOn w:val="719"/>
-    <w:link w:val="710"/>
+    <w:basedOn w:val="926"/>
+    <w:link w:val="917"/>
     <w:uiPriority w:val="9"/>
     <w:pPr>
       <w:pBdr/>
@@ -37184,10 +37169,10 @@
       <w:szCs w:val="40"/>
     </w:rPr>
   </w:style>
-  <w:style w:type="character" w:styleId="723" w:customStyle="1">
+  <w:style w:type="character" w:styleId="930" w:customStyle="1">
     <w:name w:val="Kop 2 Char"/>
-    <w:basedOn w:val="719"/>
-    <w:link w:val="711"/>
+    <w:basedOn w:val="926"/>
+    <w:link w:val="918"/>
     <w:uiPriority w:val="9"/>
     <w:semiHidden/>
     <w:pPr>
@@ -37202,10 +37187,10 @@
       <w:szCs w:val="32"/>
     </w:rPr>
   </w:style>
-  <w:style w:type="character" w:styleId="724" w:customStyle="1">
+  <w:style w:type="character" w:styleId="931" w:customStyle="1">
     <w:name w:val="Kop 3 Char"/>
-    <w:basedOn w:val="719"/>
-    <w:link w:val="712"/>
+    <w:basedOn w:val="926"/>
+    <w:link w:val="919"/>
     <w:uiPriority w:val="9"/>
     <w:semiHidden/>
     <w:pPr>
@@ -37220,10 +37205,10 @@
       <w:szCs w:val="28"/>
     </w:rPr>
   </w:style>
-  <w:style w:type="character" w:styleId="725" w:customStyle="1">
+  <w:style w:type="character" w:styleId="932" w:customStyle="1">
     <w:name w:val="Kop 4 Char"/>
-    <w:basedOn w:val="719"/>
-    <w:link w:val="713"/>
+    <w:basedOn w:val="926"/>
+    <w:link w:val="920"/>
     <w:uiPriority w:val="9"/>
     <w:semiHidden/>
     <w:pPr>
@@ -37238,10 +37223,10 @@
       <w:color w:val="0f4761" w:themeColor="accent1" w:themeShade="BF"/>
     </w:rPr>
   </w:style>
-  <w:style w:type="character" w:styleId="726" w:customStyle="1">
+  <w:style w:type="character" w:styleId="933" w:customStyle="1">
     <w:name w:val="Kop 5 Char"/>
-    <w:basedOn w:val="719"/>
-    <w:link w:val="714"/>
+    <w:basedOn w:val="926"/>
+    <w:link w:val="921"/>
     <w:uiPriority w:val="9"/>
     <w:semiHidden/>
     <w:pPr>
@@ -37254,10 +37239,10 @@
       <w:color w:val="0f4761" w:themeColor="accent1" w:themeShade="BF"/>
     </w:rPr>
   </w:style>
-  <w:style w:type="character" w:styleId="727" w:customStyle="1">
+  <w:style w:type="character" w:styleId="934" w:customStyle="1">
     <w:name w:val="Kop 6 Char"/>
-    <w:basedOn w:val="719"/>
-    <w:link w:val="715"/>
+    <w:basedOn w:val="926"/>
+    <w:link w:val="922"/>
     <w:uiPriority w:val="9"/>
     <w:semiHidden/>
     <w:pPr>
@@ -37272,10 +37257,10 @@
       <w:color w:val="595959" w:themeColor="text1" w:themeTint="A6"/>
     </w:rPr>
   </w:style>
-  <w:style w:type="character" w:styleId="728" w:customStyle="1">
+  <w:style w:type="character" w:styleId="935" w:customStyle="1">
     <w:name w:val="Kop 7 Char"/>
-    <w:basedOn w:val="719"/>
-    <w:link w:val="716"/>
+    <w:basedOn w:val="926"/>
+    <w:link w:val="923"/>
     <w:uiPriority w:val="9"/>
     <w:semiHidden/>
     <w:pPr>
@@ -37288,10 +37273,10 @@
       <w:color w:val="595959" w:themeColor="text1" w:themeTint="A6"/>
     </w:rPr>
   </w:style>
-  <w:style w:type="character" w:styleId="729" w:customStyle="1">
+  <w:style w:type="character" w:styleId="936" w:customStyle="1">
     <w:name w:val="Kop 8 Char"/>
-    <w:basedOn w:val="719"/>
-    <w:link w:val="717"/>
+    <w:basedOn w:val="926"/>
+    <w:link w:val="924"/>
     <w:uiPriority w:val="9"/>
     <w:semiHidden/>
     <w:pPr>
@@ -37306,10 +37291,10 @@
       <w:color w:val="272727" w:themeColor="text1" w:themeTint="D8"/>
     </w:rPr>
   </w:style>
-  <w:style w:type="character" w:styleId="730" w:customStyle="1">
+  <w:style w:type="character" w:styleId="937" w:customStyle="1">
     <w:name w:val="Kop 9 Char"/>
-    <w:basedOn w:val="719"/>
-    <w:link w:val="718"/>
+    <w:basedOn w:val="926"/>
+    <w:link w:val="925"/>
     <w:uiPriority w:val="9"/>
     <w:semiHidden/>
     <w:pPr>
@@ -37322,11 +37307,11 @@
       <w:color w:val="272727" w:themeColor="text1" w:themeTint="D8"/>
     </w:rPr>
   </w:style>
-  <w:style w:type="paragraph" w:styleId="731">
+  <w:style w:type="paragraph" w:styleId="938">
     <w:name w:val="Title"/>
-    <w:basedOn w:val="709"/>
-    <w:next w:val="709"/>
-    <w:link w:val="732"/>
+    <w:basedOn w:val="916"/>
+    <w:next w:val="916"/>
+    <w:link w:val="939"/>
     <w:uiPriority w:val="10"/>
     <w:qFormat/>
     <w:pPr>
@@ -37342,10 +37327,10 @@
       <w:szCs w:val="56"/>
     </w:rPr>
   </w:style>
-  <w:style w:type="character" w:styleId="732" w:customStyle="1">
+  <w:style w:type="character" w:styleId="939" w:customStyle="1">
     <w:name w:val="Titel Char"/>
-    <w:basedOn w:val="719"/>
-    <w:link w:val="731"/>
+    <w:basedOn w:val="926"/>
+    <w:link w:val="938"/>
     <w:uiPriority w:val="10"/>
     <w:pPr>
       <w:pBdr/>
@@ -37359,11 +37344,11 @@
       <w:szCs w:val="56"/>
     </w:rPr>
   </w:style>
-  <w:style w:type="paragraph" w:styleId="733">
+  <w:style w:type="paragraph" w:styleId="940">
     <w:name w:val="Subtitle"/>
-    <w:basedOn w:val="709"/>
-    <w:next w:val="709"/>
-    <w:link w:val="734"/>
+    <w:basedOn w:val="916"/>
+    <w:next w:val="916"/>
+    <w:link w:val="941"/>
     <w:uiPriority w:val="11"/>
     <w:qFormat/>
     <w:pPr>
@@ -37382,10 +37367,10 @@
       <w:szCs w:val="28"/>
     </w:rPr>
   </w:style>
-  <w:style w:type="character" w:styleId="734" w:customStyle="1">
+  <w:style w:type="character" w:styleId="941" w:customStyle="1">
     <w:name w:val="Ondertitel Char"/>
-    <w:basedOn w:val="719"/>
-    <w:link w:val="733"/>
+    <w:basedOn w:val="926"/>
+    <w:link w:val="940"/>
     <w:uiPriority w:val="11"/>
     <w:pPr>
       <w:pBdr/>
@@ -37400,11 +37385,11 @@
       <w:szCs w:val="28"/>
     </w:rPr>
   </w:style>
-  <w:style w:type="paragraph" w:styleId="735">
+  <w:style w:type="paragraph" w:styleId="942">
     <w:name w:val="Quote"/>
-    <w:basedOn w:val="709"/>
-    <w:next w:val="709"/>
-    <w:link w:val="736"/>
+    <w:basedOn w:val="916"/>
+    <w:next w:val="916"/>
+    <w:link w:val="943"/>
     <w:uiPriority w:val="29"/>
     <w:qFormat/>
     <w:pPr>
@@ -37419,10 +37404,10 @@
       <w:color w:val="404040" w:themeColor="text1" w:themeTint="BF"/>
     </w:rPr>
   </w:style>
-  <w:style w:type="character" w:styleId="736" w:customStyle="1">
+  <w:style w:type="character" w:styleId="943" w:customStyle="1">
     <w:name w:val="Citaat Char"/>
-    <w:basedOn w:val="719"/>
-    <w:link w:val="735"/>
+    <w:basedOn w:val="926"/>
+    <w:link w:val="942"/>
     <w:uiPriority w:val="29"/>
     <w:pPr>
       <w:pBdr/>
@@ -37435,9 +37420,9 @@
       <w:color w:val="404040" w:themeColor="text1" w:themeTint="BF"/>
     </w:rPr>
   </w:style>
-  <w:style w:type="paragraph" w:styleId="737">
+  <w:style w:type="paragraph" w:styleId="944">
     <w:name w:val="List Paragraph"/>
-    <w:basedOn w:val="709"/>
+    <w:basedOn w:val="916"/>
     <w:uiPriority w:val="34"/>
     <w:qFormat/>
     <w:pPr>
@@ -37447,9 +37432,9 @@
       <w:contextualSpacing w:val="true"/>
     </w:pPr>
   </w:style>
-  <w:style w:type="character" w:styleId="738">
+  <w:style w:type="character" w:styleId="945">
     <w:name w:val="Intense Emphasis"/>
-    <w:basedOn w:val="719"/>
+    <w:basedOn w:val="926"/>
     <w:uiPriority w:val="21"/>
     <w:qFormat/>
     <w:pPr>
@@ -37463,11 +37448,11 @@
       <w:color w:val="0f4761" w:themeColor="accent1" w:themeShade="BF"/>
     </w:rPr>
   </w:style>
-  <w:style w:type="paragraph" w:styleId="739">
+  <w:style w:type="paragraph" w:styleId="946">
     <w:name w:val="Intense Quote"/>
-    <w:basedOn w:val="709"/>
-    <w:next w:val="709"/>
-    <w:link w:val="740"/>
+    <w:basedOn w:val="916"/>
+    <w:next w:val="916"/>
+    <w:link w:val="947"/>
     <w:uiPriority w:val="30"/>
     <w:qFormat/>
     <w:pPr>
@@ -37485,10 +37470,10 @@
       <w:color w:val="0f4761" w:themeColor="accent1" w:themeShade="BF"/>
     </w:rPr>
   </w:style>
-  <w:style w:type="character" w:styleId="740" w:customStyle="1">
+  <w:style w:type="character" w:styleId="947" w:customStyle="1">
     <w:name w:val="Duidelijk citaat Char"/>
-    <w:basedOn w:val="719"/>
-    <w:link w:val="739"/>
+    <w:basedOn w:val="926"/>
+    <w:link w:val="946"/>
     <w:uiPriority w:val="30"/>
     <w:pPr>
       <w:pBdr/>
@@ -37501,9 +37486,9 @@
       <w:color w:val="0f4761" w:themeColor="accent1" w:themeShade="BF"/>
     </w:rPr>
   </w:style>
-  <w:style w:type="character" w:styleId="741">
+  <w:style w:type="character" w:styleId="948">
     <w:name w:val="Intense Reference"/>
-    <w:basedOn w:val="719"/>
+    <w:basedOn w:val="926"/>
     <w:uiPriority w:val="32"/>
     <w:qFormat/>
     <w:pPr>

</xml_diff>